<commit_message>
Definitions en francais, manuels 2.1, accueil sans graphique
</commit_message>
<xml_diff>
--- a/inst/app/www/manuel/manuel_opesc_en.docx
+++ b/inst/app/www/manuel/manuel_opesc_en.docx
@@ -59,7 +59,7 @@
           <w:sz w:val="24"/>
           <w:szCs w:val="24"/>
         </w:rPr>
-        <w:t xml:space="preserve">Version 2.0</w:t>
+        <w:t xml:space="preserve">Version 2.1</w:t>
       </w:r>
     </w:p>
     <w:p>
@@ -100,7 +100,7 @@
           <w:sz w:val="22"/>
           <w:szCs w:val="22"/>
         </w:rPr>
-        <w:t xml:space="preserve">August 2026</w:t>
+        <w:t xml:space="preserve">September 2026</w:t>
       </w:r>
     </w:p>
     <w:p>
@@ -484,6 +484,33 @@
           <w:sz w:val="19"/>
           <w:szCs w:val="19"/>
         </w:rPr>
+        <w:t xml:space="preserve">What appears at start-up</w:t>
+      </w:r>
+      <w:r>
+        <w:rPr>
+          <w:color w:val="5C6672"/>
+          <w:sz w:val="19"/>
+          <w:szCs w:val="19"/>
+        </w:rPr>
+        <w:t xml:space="preserve">	10</w:t>
+      </w:r>
+    </w:p>
+    <w:p>
+      <w:pPr>
+        <w:tabs>
+          <w:tab w:val="right" w:pos="9354" w:leader="dot"/>
+        </w:tabs>
+        <w:spacing w:after="30" w:line="240"/>
+        <w:ind w:left="340"/>
+      </w:pPr>
+      <w:r>
+        <w:rPr>
+          <w:b w:val="false"/>
+          <w:bCs w:val="false"/>
+          <w:color w:val="3C4650"/>
+          <w:sz w:val="19"/>
+          <w:szCs w:val="19"/>
+        </w:rPr>
         <w:t xml:space="preserve">Choosing a category</w:t>
       </w:r>
       <w:r>
@@ -546,7 +573,7 @@
           <w:sz w:val="19"/>
           <w:szCs w:val="19"/>
         </w:rPr>
-        <w:t xml:space="preserve">	10</w:t>
+        <w:t xml:space="preserve">	11</w:t>
       </w:r>
     </w:p>
     <w:p>
@@ -627,7 +654,7 @@
           <w:sz w:val="19"/>
           <w:szCs w:val="19"/>
         </w:rPr>
-        <w:t xml:space="preserve">	11</w:t>
+        <w:t xml:space="preserve">	12</w:t>
       </w:r>
     </w:p>
     <w:p>
@@ -707,7 +734,7 @@
           <w:sz w:val="19"/>
           <w:szCs w:val="19"/>
         </w:rPr>
-        <w:t xml:space="preserve">	12</w:t>
+        <w:t xml:space="preserve">	13</w:t>
       </w:r>
     </w:p>
     <w:p>
@@ -733,7 +760,7 @@
           <w:sz w:val="19"/>
           <w:szCs w:val="19"/>
         </w:rPr>
-        <w:t xml:space="preserve">	13</w:t>
+        <w:t xml:space="preserve">	14</w:t>
       </w:r>
     </w:p>
     <w:p>
@@ -832,7 +859,7 @@
           <w:sz w:val="19"/>
           <w:szCs w:val="19"/>
         </w:rPr>
-        <w:t xml:space="preserve">Configuring web search</w:t>
+        <w:t xml:space="preserve">The definition and its source</w:t>
       </w:r>
       <w:r>
         <w:rPr>
@@ -840,7 +867,34 @@
           <w:sz w:val="19"/>
           <w:szCs w:val="19"/>
         </w:rPr>
-        <w:t xml:space="preserve">	14</w:t>
+        <w:t xml:space="preserve">	16</w:t>
+      </w:r>
+    </w:p>
+    <w:p>
+      <w:pPr>
+        <w:tabs>
+          <w:tab w:val="right" w:pos="9354" w:leader="dot"/>
+        </w:tabs>
+        <w:spacing w:after="30" w:line="240"/>
+        <w:ind w:left="340"/>
+      </w:pPr>
+      <w:r>
+        <w:rPr>
+          <w:b w:val="false"/>
+          <w:bCs w:val="false"/>
+          <w:color w:val="3C4650"/>
+          <w:sz w:val="19"/>
+          <w:szCs w:val="19"/>
+        </w:rPr>
+        <w:t xml:space="preserve">Configuring web search</w:t>
+      </w:r>
+      <w:r>
+        <w:rPr>
+          <w:color w:val="5C6672"/>
+          <w:sz w:val="19"/>
+          <w:szCs w:val="19"/>
+        </w:rPr>
+        <w:t xml:space="preserve">	16</w:t>
       </w:r>
     </w:p>
     <w:p>
@@ -893,7 +947,7 @@
           <w:sz w:val="19"/>
           <w:szCs w:val="19"/>
         </w:rPr>
-        <w:t xml:space="preserve">	16</w:t>
+        <w:t xml:space="preserve">	17</w:t>
       </w:r>
     </w:p>
     <w:p>
@@ -920,7 +974,7 @@
           <w:sz w:val="19"/>
           <w:szCs w:val="19"/>
         </w:rPr>
-        <w:t xml:space="preserve">	16</w:t>
+        <w:t xml:space="preserve">	17</w:t>
       </w:r>
     </w:p>
     <w:p>
@@ -1000,7 +1054,7 @@
           <w:sz w:val="19"/>
           <w:szCs w:val="19"/>
         </w:rPr>
-        <w:t xml:space="preserve">	17</w:t>
+        <w:t xml:space="preserve">	18</w:t>
       </w:r>
     </w:p>
     <w:p>
@@ -1019,7 +1073,7 @@
           <w:sz w:val="19"/>
           <w:szCs w:val="19"/>
         </w:rPr>
-        <w:t xml:space="preserve">The two commodity categories</w:t>
+        <w:t xml:space="preserve">The commodity price category</w:t>
       </w:r>
       <w:r>
         <w:rPr>
@@ -1027,7 +1081,7 @@
           <w:sz w:val="19"/>
           <w:szCs w:val="19"/>
         </w:rPr>
-        <w:t xml:space="preserve">	17</w:t>
+        <w:t xml:space="preserve">	18</w:t>
       </w:r>
     </w:p>
     <w:p>
@@ -1188,7 +1242,7 @@
           <w:sz w:val="19"/>
           <w:szCs w:val="19"/>
         </w:rPr>
-        <w:t xml:space="preserve">	18</w:t>
+        <w:t xml:space="preserve">	19</w:t>
       </w:r>
     </w:p>
     <w:p>
@@ -1215,7 +1269,7 @@
           <w:sz w:val="19"/>
           <w:szCs w:val="19"/>
         </w:rPr>
-        <w:t xml:space="preserve">	18</w:t>
+        <w:t xml:space="preserve">	19</w:t>
       </w:r>
     </w:p>
     <w:p>
@@ -1349,7 +1403,7 @@
           <w:sz w:val="19"/>
           <w:szCs w:val="19"/>
         </w:rPr>
-        <w:t xml:space="preserve">	19</w:t>
+        <w:t xml:space="preserve">	20</w:t>
       </w:r>
     </w:p>
     <w:p>
@@ -1376,7 +1430,7 @@
           <w:sz w:val="19"/>
           <w:szCs w:val="19"/>
         </w:rPr>
-        <w:t xml:space="preserve">	19</w:t>
+        <w:t xml:space="preserve">	20</w:t>
       </w:r>
     </w:p>
     <w:p>
@@ -1456,7 +1510,7 @@
           <w:sz w:val="19"/>
           <w:szCs w:val="19"/>
         </w:rPr>
-        <w:t xml:space="preserve">	20</w:t>
+        <w:t xml:space="preserve">	21</w:t>
       </w:r>
     </w:p>
     <w:p>
@@ -1483,7 +1537,7 @@
           <w:sz w:val="19"/>
           <w:szCs w:val="19"/>
         </w:rPr>
-        <w:t xml:space="preserve">	20</w:t>
+        <w:t xml:space="preserve">	21</w:t>
       </w:r>
     </w:p>
     <w:p>
@@ -1671,7 +1725,7 @@
           <w:sz w:val="19"/>
           <w:szCs w:val="19"/>
         </w:rPr>
-        <w:t xml:space="preserve">	21</w:t>
+        <w:t xml:space="preserve">	22</w:t>
       </w:r>
     </w:p>
     <w:p>
@@ -1698,7 +1752,7 @@
           <w:sz w:val="19"/>
           <w:szCs w:val="19"/>
         </w:rPr>
-        <w:t xml:space="preserve">	21</w:t>
+        <w:t xml:space="preserve">	30</w:t>
       </w:r>
     </w:p>
     <w:p>
@@ -1724,7 +1778,7 @@
           <w:sz w:val="19"/>
           <w:szCs w:val="19"/>
         </w:rPr>
-        <w:t xml:space="preserve">	22</w:t>
+        <w:t xml:space="preserve">	30</w:t>
       </w:r>
     </w:p>
     <w:p>
@@ -1776,7 +1830,7 @@
           <w:sz w:val="19"/>
           <w:szCs w:val="19"/>
         </w:rPr>
-        <w:t xml:space="preserve">	30</w:t>
+        <w:t xml:space="preserve">	</w:t>
       </w:r>
     </w:p>
     <w:p>
@@ -1802,7 +1856,7 @@
           <w:sz w:val="19"/>
           <w:szCs w:val="19"/>
         </w:rPr>
-        <w:t xml:space="preserve">	30</w:t>
+        <w:t xml:space="preserve">	</w:t>
       </w:r>
     </w:p>
     <w:p>
@@ -1969,7 +2023,7 @@
           <w:sz w:val="21"/>
           <w:szCs w:val="21"/>
         </w:rPr>
-        <w:t xml:space="preserve">Table 9.1. What distinguishes C01 from C15</w:t>
+        <w:t xml:space="preserve">Table 9. Recognised frequencies</w:t>
       </w:r>
     </w:p>
     <w:p>
@@ -1986,24 +2040,7 @@
           <w:sz w:val="21"/>
           <w:szCs w:val="21"/>
         </w:rPr>
-        <w:t xml:space="preserve">Table 10. Recognised frequencies</w:t>
-      </w:r>
-    </w:p>
-    <w:p>
-      <w:pPr>
-        <w:spacing w:after="70" w:line="288"/>
-        <w:jc w:val="left"/>
-      </w:pPr>
-      <w:r>
-        <w:rPr>
-          <w:b w:val="false"/>
-          <w:bCs w:val="false"/>
-          <w:i w:val="false"/>
-          <w:iCs w:val="false"/>
-          <w:sz w:val="21"/>
-          <w:szCs w:val="21"/>
-        </w:rPr>
-        <w:t xml:space="preserve">Table 11. Terms used in this manual</w:t>
+        <w:t xml:space="preserve">Table 10. Terms used in this manual</w:t>
       </w:r>
     </w:p>
     <w:p>
@@ -2563,7 +2600,7 @@
                 <w:sz w:val="18"/>
                 <w:szCs w:val="18"/>
               </w:rPr>
-              <w:t xml:space="preserve">341</w:t>
+              <w:t xml:space="preserve">313</w:t>
             </w:r>
           </w:p>
         </w:tc>
@@ -2617,7 +2654,7 @@
                 <w:sz w:val="18"/>
                 <w:szCs w:val="18"/>
               </w:rPr>
-              <w:t xml:space="preserve">15</w:t>
+              <w:t xml:space="preserve">14</w:t>
             </w:r>
           </w:p>
         </w:tc>
@@ -2829,7 +2866,7 @@
                 <w:sz w:val="18"/>
                 <w:szCs w:val="18"/>
               </w:rPr>
-              <w:t xml:space="preserve">3, plus one shipped file</w:t>
+              <w:t xml:space="preserve">3, plus one imported file</w:t>
             </w:r>
           </w:p>
         </w:tc>
@@ -3855,7 +3892,7 @@
           <w:sz w:val="21"/>
           <w:szCs w:val="21"/>
         </w:rPr>
-        <w:t xml:space="preserve">The translation covers the interface, the labels of the fifteen categories, those of the 233 indicators and their units. Country names are supplied in English by the World Bank.</w:t>
+        <w:t xml:space="preserve">The translation covers the interface, the labels of the fourteen categories, those of the 313 indicators and their units. Country names are supplied in English by the World Bank.</w:t>
       </w:r>
     </w:p>
     <w:p>
@@ -4150,7 +4187,7 @@
         <w:pStyle w:val="Heading2"/>
       </w:pPr>
       <w:r>
-        <w:t xml:space="preserve">4.1 Choosing a category</w:t>
+        <w:t xml:space="preserve">4.1 What appears at start-up</w:t>
       </w:r>
     </w:p>
     <w:p>
@@ -4167,7 +4204,49 @@
           <w:sz w:val="21"/>
           <w:szCs w:val="21"/>
         </w:rPr>
-        <w:t xml:space="preserve">The first panel shows the fifteen categories, ordered to follow the logic of an economic outlook note: commodities first, then the real sector, public finance, the monetary sector, the external sector, exchange rates and interest rates.</w:t>
+        <w:t xml:space="preserve">The dashboard plots gross domestic product per capita growth for Cameroon, annually, from the outset, and the database opens on a populated category. This selection is replaced by the first filter applied.</w:t>
+      </w:r>
+    </w:p>
+    <w:p>
+      <w:pPr>
+        <w:spacing w:after="140" w:line="288"/>
+        <w:jc w:val="both"/>
+      </w:pPr>
+      <w:r>
+        <w:rPr>
+          <w:b w:val="false"/>
+          <w:bCs w:val="false"/>
+          <w:i w:val="false"/>
+          <w:iCs w:val="false"/>
+          <w:sz w:val="21"/>
+          <w:szCs w:val="21"/>
+        </w:rPr>
+        <w:t xml:space="preserve">An empty screen at first sight teaches nothing, and an empty table even suggests the database is empty too.</w:t>
+      </w:r>
+    </w:p>
+    <w:p>
+      <w:pPr>
+        <w:pStyle w:val="Heading2"/>
+      </w:pPr>
+      <w:r>
+        <w:t xml:space="preserve">4.2 Choosing a category</w:t>
+      </w:r>
+    </w:p>
+    <w:p>
+      <w:pPr>
+        <w:spacing w:after="140" w:line="288"/>
+        <w:jc w:val="both"/>
+      </w:pPr>
+      <w:r>
+        <w:rPr>
+          <w:b w:val="false"/>
+          <w:bCs w:val="false"/>
+          <w:i w:val="false"/>
+          <w:iCs w:val="false"/>
+          <w:sz w:val="21"/>
+          <w:szCs w:val="21"/>
+        </w:rPr>
+        <w:t xml:space="preserve">The first panel shows the fourteen categories, ordered to follow the logic of an economic outlook note: commodities first, then the real sector, public finance, the monetary sector, the external sector, exchange rates and interest rates.</w:t>
       </w:r>
     </w:p>
     <w:p>
@@ -4192,7 +4271,7 @@
         <w:pStyle w:val="Heading2"/>
       </w:pPr>
       <w:r>
-        <w:t xml:space="preserve">4.2 The filter bar</w:t>
+        <w:t xml:space="preserve">4.3 The filter bar</w:t>
       </w:r>
     </w:p>
     <w:p>
@@ -4392,7 +4471,7 @@
         <w:pStyle w:val="Heading2"/>
       </w:pPr>
       <w:r>
-        <w:t xml:space="preserve">4.3 Overlaying series</w:t>
+        <w:t xml:space="preserve">4.4 Overlaying series</w:t>
       </w:r>
     </w:p>
     <w:p>
@@ -4519,7 +4598,7 @@
         <w:pStyle w:val="Heading2"/>
       </w:pPr>
       <w:r>
-        <w:t xml:space="preserve">4.4 The four representations</w:t>
+        <w:t xml:space="preserve">4.5 The four representations</w:t>
       </w:r>
     </w:p>
     <w:tbl>
@@ -5066,7 +5145,7 @@
         <w:pStyle w:val="Heading2"/>
       </w:pPr>
       <w:r>
-        <w:t xml:space="preserve">4.5 Projections</w:t>
+        <w:t xml:space="preserve">4.6 Projections</w:t>
       </w:r>
     </w:p>
     <w:p>
@@ -5533,7 +5612,7 @@
         <w:pStyle w:val="Heading2"/>
       </w:pPr>
       <w:r>
-        <w:t xml:space="preserve">4.6 Exporting</w:t>
+        <w:t xml:space="preserve">4.7 Exporting</w:t>
       </w:r>
     </w:p>
     <w:p>
@@ -6372,7 +6451,7 @@
           <w:sz w:val="21"/>
           <w:szCs w:val="21"/>
         </w:rPr>
-        <w:t xml:space="preserve">From two characters onwards, a completion list appears below the field. It draws on the glossary, the fifteen categories and the indicator labels: suggestions therefore cover what the platform can actually handle, not a general dictionary.</w:t>
+        <w:t xml:space="preserve">From two characters onwards, a completion list appears below the field. It draws on the glossary, the fourteen categories and the indicator labels: suggestions therefore cover what the platform can actually handle, not a general dictionary.</w:t>
       </w:r>
     </w:p>
     <w:p>
@@ -6380,7 +6459,134 @@
         <w:pStyle w:val="Heading2"/>
       </w:pPr>
       <w:r>
-        <w:t xml:space="preserve">7.3 Configuring web search</w:t>
+        <w:t xml:space="preserve">7.3 The definition and its source</w:t>
+      </w:r>
+    </w:p>
+    <w:p>
+      <w:pPr>
+        <w:spacing w:after="140" w:line="288"/>
+        <w:jc w:val="both"/>
+      </w:pPr>
+      <w:r>
+        <w:rPr>
+          <w:b w:val="false"/>
+          <w:bCs w:val="false"/>
+          <w:i w:val="false"/>
+          <w:iCs w:val="false"/>
+          <w:sz w:val="21"/>
+          <w:szCs w:val="21"/>
+        </w:rPr>
+        <w:t xml:space="preserve">Every indicator shown carries its definition and, below it, the name of the institution that stands behind it. The World Bank publishes, for each of its series, a definition text and the organisation that establishes it: both are reproduced as they stand.</w:t>
+      </w:r>
+    </w:p>
+    <w:p>
+      <w:pPr>
+        <w:spacing w:after="140" w:line="288"/>
+        <w:jc w:val="both"/>
+      </w:pPr>
+      <w:r>
+        <w:rPr>
+          <w:b w:val="false"/>
+          <w:bCs w:val="false"/>
+          <w:i w:val="false"/>
+          <w:iCs w:val="false"/>
+          <w:sz w:val="21"/>
+          <w:szCs w:val="21"/>
+        </w:rPr>
+        <w:t xml:space="preserve">For general notions, the glossary definitions point to the manual they are drawn from: the System of National Accounts for gross domestic product, the Balance of Payments Manual for the current account, the resolutions of the International Conference of Labour Statisticians for unemployment.</w:t>
+      </w:r>
+    </w:p>
+    <w:tbl>
+      <w:tblPr>
+        <w:tblW w:type="dxa" w:w="9354"/>
+        <w:tblBorders>
+          <w:top w:val="single" w:color="auto" w:sz="4"/>
+          <w:left w:val="single" w:color="auto" w:sz="4"/>
+          <w:bottom w:val="single" w:color="auto" w:sz="4"/>
+          <w:right w:val="single" w:color="auto" w:sz="4"/>
+          <w:insideH w:val="single" w:color="auto" w:sz="4"/>
+          <w:insideV w:val="single" w:color="auto" w:sz="4"/>
+        </w:tblBorders>
+      </w:tblPr>
+      <w:tblGrid>
+        <w:gridCol w:w="9354"/>
+      </w:tblGrid>
+      <w:tr>
+        <w:tc>
+          <w:tcPr>
+            <w:tcW w:type="dxa" w:w="9354"/>
+            <w:tcBorders>
+              <w:top w:val="single" w:color="9A9A9A" w:sz="4"/>
+              <w:left w:val="single" w:color="9A9A9A" w:sz="4"/>
+              <w:bottom w:val="single" w:color="9A9A9A" w:sz="4"/>
+              <w:right w:val="single" w:color="9A9A9A" w:sz="4"/>
+            </w:tcBorders>
+            <w:shd w:fill="EFEFEF" w:color="auto" w:val="clear"/>
+            <w:tcMar>
+              <w:top w:type="dxa" w:w="60"/>
+              <w:left w:type="dxa" w:w="90"/>
+              <w:bottom w:type="dxa" w:w="60"/>
+              <w:right w:type="dxa" w:w="90"/>
+            </w:tcMar>
+          </w:tcPr>
+          <w:p>
+            <w:pPr>
+              <w:spacing w:after="70" w:line="276"/>
+              <w:jc w:val="left"/>
+            </w:pPr>
+            <w:r>
+              <w:rPr>
+                <w:b/>
+                <w:bCs/>
+                <w:color w:val="000000"/>
+                <w:sz w:val="19"/>
+                <w:szCs w:val="19"/>
+              </w:rPr>
+              <w:t xml:space="preserve">Why the source is always named</w:t>
+            </w:r>
+          </w:p>
+          <w:p>
+            <w:pPr>
+              <w:spacing w:after="0" w:line="276"/>
+              <w:jc w:val="both"/>
+            </w:pPr>
+            <w:r>
+              <w:rPr>
+                <w:b w:val="false"/>
+                <w:bCs w:val="false"/>
+                <w:color w:val="000000"/>
+                <w:sz w:val="19"/>
+                <w:szCs w:val="19"/>
+              </w:rPr>
+              <w:t xml:space="preserve">A definition without a source is worth nothing in an administrative document: the World Bank's commits the World Bank, an anonymous one commits no one. It also lets the reference be cited in a note without having to look it up.</w:t>
+            </w:r>
+          </w:p>
+        </w:tc>
+      </w:tr>
+    </w:tbl>
+    <w:p>
+      <w:pPr>
+        <w:spacing w:after="200" w:line="288"/>
+        <w:jc w:val="both"/>
+      </w:pPr>
+      <w:r>
+        <w:rPr>
+          <w:b w:val="false"/>
+          <w:bCs w:val="false"/>
+          <w:i w:val="false"/>
+          <w:iCs w:val="false"/>
+          <w:sz w:val="21"/>
+          <w:szCs w:val="21"/>
+        </w:rPr>
+        <w:t xml:space="preserve"/>
+      </w:r>
+    </w:p>
+    <w:p>
+      <w:pPr>
+        <w:pStyle w:val="Heading2"/>
+      </w:pPr>
+      <w:r>
+        <w:t xml:space="preserve">7.4 Configuring web search</w:t>
       </w:r>
     </w:p>
     <w:p>
@@ -7727,287 +7933,7 @@
         <w:pStyle w:val="Heading2"/>
       </w:pPr>
       <w:r>
-        <w:t xml:space="preserve">9.3 The two commodity categories</w:t>
-      </w:r>
-    </w:p>
-    <w:tbl>
-      <w:tblPr>
-        <w:tblW w:type="dxa" w:w="9354"/>
-        <w:tblBorders>
-          <w:top w:val="single" w:color="auto" w:sz="4"/>
-          <w:left w:val="single" w:color="auto" w:sz="4"/>
-          <w:bottom w:val="single" w:color="auto" w:sz="4"/>
-          <w:right w:val="single" w:color="auto" w:sz="4"/>
-          <w:insideH w:val="single" w:color="auto" w:sz="4"/>
-          <w:insideV w:val="single" w:color="auto" w:sz="4"/>
-        </w:tblBorders>
-      </w:tblPr>
-      <w:tblGrid>
-        <w:gridCol w:w="2500"/>
-        <w:gridCol w:w="3500"/>
-        <w:gridCol w:w="3354"/>
-      </w:tblGrid>
-      <w:tr>
-        <w:trPr>
-          <w:tblHeader/>
-        </w:trPr>
-        <w:tc>
-          <w:tcPr>
-            <w:tcW w:type="dxa" w:w="2500"/>
-            <w:shd w:fill="3A3A3A" w:color="auto" w:val="clear"/>
-            <w:tcMar>
-              <w:top w:type="dxa" w:w="60"/>
-              <w:left w:type="dxa" w:w="90"/>
-              <w:bottom w:type="dxa" w:w="60"/>
-              <w:right w:type="dxa" w:w="90"/>
-            </w:tcMar>
-          </w:tcPr>
-          <w:p>
-            <w:pPr>
-              <w:spacing w:after="0" w:line="240"/>
-              <w:jc w:val="left"/>
-            </w:pPr>
-            <w:r>
-              <w:rPr>
-                <w:b/>
-                <w:bCs/>
-                <w:color w:val="FFFFFF"/>
-                <w:sz w:val="18"/>
-                <w:szCs w:val="18"/>
-              </w:rPr>
-              <w:t xml:space="preserve">Category</w:t>
-            </w:r>
-          </w:p>
-        </w:tc>
-        <w:tc>
-          <w:tcPr>
-            <w:tcW w:type="dxa" w:w="3500"/>
-            <w:shd w:fill="3A3A3A" w:color="auto" w:val="clear"/>
-            <w:tcMar>
-              <w:top w:type="dxa" w:w="60"/>
-              <w:left w:type="dxa" w:w="90"/>
-              <w:bottom w:type="dxa" w:w="60"/>
-              <w:right w:type="dxa" w:w="90"/>
-            </w:tcMar>
-          </w:tcPr>
-          <w:p>
-            <w:pPr>
-              <w:spacing w:after="0" w:line="240"/>
-              <w:jc w:val="left"/>
-            </w:pPr>
-            <w:r>
-              <w:rPr>
-                <w:b/>
-                <w:bCs/>
-                <w:color w:val="FFFFFF"/>
-                <w:sz w:val="18"/>
-                <w:szCs w:val="18"/>
-              </w:rPr>
-              <w:t xml:space="preserve">Content</w:t>
-            </w:r>
-          </w:p>
-        </w:tc>
-        <w:tc>
-          <w:tcPr>
-            <w:tcW w:type="dxa" w:w="3354"/>
-            <w:shd w:fill="3A3A3A" w:color="auto" w:val="clear"/>
-            <w:tcMar>
-              <w:top w:type="dxa" w:w="60"/>
-              <w:left w:type="dxa" w:w="90"/>
-              <w:bottom w:type="dxa" w:w="60"/>
-              <w:right w:type="dxa" w:w="90"/>
-            </w:tcMar>
-          </w:tcPr>
-          <w:p>
-            <w:pPr>
-              <w:spacing w:after="0" w:line="240"/>
-              <w:jc w:val="left"/>
-            </w:pPr>
-            <w:r>
-              <w:rPr>
-                <w:b/>
-                <w:bCs/>
-                <w:color w:val="FFFFFF"/>
-                <w:sz w:val="18"/>
-                <w:szCs w:val="18"/>
-              </w:rPr>
-              <w:t xml:space="preserve">Use</w:t>
-            </w:r>
-          </w:p>
-        </w:tc>
-      </w:tr>
-      <w:tr>
-        <w:tc>
-          <w:tcPr>
-            <w:tcW w:type="dxa" w:w="2500"/>
-            <w:tcMar>
-              <w:top w:type="dxa" w:w="60"/>
-              <w:left w:type="dxa" w:w="90"/>
-              <w:bottom w:type="dxa" w:w="60"/>
-              <w:right w:type="dxa" w:w="90"/>
-            </w:tcMar>
-          </w:tcPr>
-          <w:p>
-            <w:pPr>
-              <w:spacing w:after="0" w:line="240"/>
-              <w:jc w:val="left"/>
-            </w:pPr>
-            <w:r>
-              <w:rPr>
-                <w:color w:val="000000"/>
-                <w:sz w:val="18"/>
-                <w:szCs w:val="18"/>
-              </w:rPr>
-              <w:t xml:space="preserve">C01, Commodities</w:t>
-            </w:r>
-          </w:p>
-        </w:tc>
-        <w:tc>
-          <w:tcPr>
-            <w:tcW w:type="dxa" w:w="3500"/>
-            <w:tcMar>
-              <w:top w:type="dxa" w:w="60"/>
-              <w:left w:type="dxa" w:w="90"/>
-              <w:bottom w:type="dxa" w:w="60"/>
-              <w:right w:type="dxa" w:w="90"/>
-            </w:tcMar>
-          </w:tcPr>
-          <w:p>
-            <w:pPr>
-              <w:spacing w:after="0" w:line="240"/>
-              <w:jc w:val="left"/>
-            </w:pPr>
-            <w:r>
-              <w:rPr>
-                <w:color w:val="000000"/>
-                <w:sz w:val="18"/>
-                <w:szCs w:val="18"/>
-              </w:rPr>
-              <w:t xml:space="preserve">28 main quotations, curated</w:t>
-            </w:r>
-          </w:p>
-        </w:tc>
-        <w:tc>
-          <w:tcPr>
-            <w:tcW w:type="dxa" w:w="3354"/>
-            <w:tcMar>
-              <w:top w:type="dxa" w:w="60"/>
-              <w:left w:type="dxa" w:w="90"/>
-              <w:bottom w:type="dxa" w:w="60"/>
-              <w:right w:type="dxa" w:w="90"/>
-            </w:tcMar>
-          </w:tcPr>
-          <w:p>
-            <w:pPr>
-              <w:spacing w:after="0" w:line="240"/>
-              <w:jc w:val="left"/>
-            </w:pPr>
-            <w:r>
-              <w:rPr>
-                <w:color w:val="000000"/>
-                <w:sz w:val="18"/>
-                <w:szCs w:val="18"/>
-              </w:rPr>
-              <w:t xml:space="preserve">Routine monitoring, dashboard</w:t>
-            </w:r>
-          </w:p>
-        </w:tc>
-      </w:tr>
-      <w:tr>
-        <w:tc>
-          <w:tcPr>
-            <w:tcW w:type="dxa" w:w="2500"/>
-            <w:shd w:fill="F2F2F2" w:color="auto" w:val="clear"/>
-            <w:tcMar>
-              <w:top w:type="dxa" w:w="60"/>
-              <w:left w:type="dxa" w:w="90"/>
-              <w:bottom w:type="dxa" w:w="60"/>
-              <w:right w:type="dxa" w:w="90"/>
-            </w:tcMar>
-          </w:tcPr>
-          <w:p>
-            <w:pPr>
-              <w:spacing w:after="0" w:line="240"/>
-              <w:jc w:val="left"/>
-            </w:pPr>
-            <w:r>
-              <w:rPr>
-                <w:color w:val="000000"/>
-                <w:sz w:val="18"/>
-                <w:szCs w:val="18"/>
-              </w:rPr>
-              <w:t xml:space="preserve">C15, Commodity prices</w:t>
-            </w:r>
-          </w:p>
-        </w:tc>
-        <w:tc>
-          <w:tcPr>
-            <w:tcW w:type="dxa" w:w="3500"/>
-            <w:shd w:fill="F2F2F2" w:color="auto" w:val="clear"/>
-            <w:tcMar>
-              <w:top w:type="dxa" w:w="60"/>
-              <w:left w:type="dxa" w:w="90"/>
-              <w:bottom w:type="dxa" w:w="60"/>
-              <w:right w:type="dxa" w:w="90"/>
-            </w:tcMar>
-          </w:tcPr>
-          <w:p>
-            <w:pPr>
-              <w:spacing w:after="0" w:line="240"/>
-              <w:jc w:val="left"/>
-            </w:pPr>
-            <w:r>
-              <w:rPr>
-                <w:color w:val="000000"/>
-                <w:sz w:val="18"/>
-                <w:szCs w:val="18"/>
-              </w:rPr>
-              <w:t xml:space="preserve">108 products, the file's full catalogue</w:t>
-            </w:r>
-          </w:p>
-        </w:tc>
-        <w:tc>
-          <w:tcPr>
-            <w:tcW w:type="dxa" w:w="3354"/>
-            <w:shd w:fill="F2F2F2" w:color="auto" w:val="clear"/>
-            <w:tcMar>
-              <w:top w:type="dxa" w:w="60"/>
-              <w:left w:type="dxa" w:w="90"/>
-              <w:bottom w:type="dxa" w:w="60"/>
-              <w:right w:type="dxa" w:w="90"/>
-            </w:tcMar>
-          </w:tcPr>
-          <w:p>
-            <w:pPr>
-              <w:spacing w:after="0" w:line="240"/>
-              <w:jc w:val="left"/>
-            </w:pPr>
-            <w:r>
-              <w:rPr>
-                <w:color w:val="000000"/>
-                <w:sz w:val="18"/>
-                <w:szCs w:val="18"/>
-              </w:rPr>
-              <w:t xml:space="preserve">Exhaustive search, rare products</w:t>
-            </w:r>
-          </w:p>
-        </w:tc>
-      </w:tr>
-    </w:tbl>
-    <w:p>
-      <w:pPr>
-        <w:spacing w:after="220" w:before="90"/>
-        <w:jc w:val="center"/>
-      </w:pPr>
-      <w:r>
-        <w:rPr>
-          <w:i/>
-          <w:iCs/>
-          <w:color w:val="5C6672"/>
-          <w:sz w:val="17"/>
-          <w:szCs w:val="17"/>
-        </w:rPr>
-        <w:t xml:space="preserve">Table 9.1. What distinguishes C01 from C15</w:t>
+        <w:t xml:space="preserve">9.3 The commodity price category</w:t>
       </w:r>
     </w:p>
     <w:p>
@@ -8024,7 +7950,41 @@
           <w:sz w:val="21"/>
           <w:szCs w:val="21"/>
         </w:rPr>
-        <w:t xml:space="preserve">Category C15 holds aggregate indices, energy transition metals, rare earths and teas by origin. Fourteen series from the file were set aside: they are exchange rates, recognisable by their code, and have no place in a category of products.</w:t>
+        <w:t xml:space="preserve">Category C15 gathers the 108 products of the downloaded file: aggregate indices, precious metals and energy transition metals, rare earths, cereals, oilseeds, meats, seafood, timber, fertilisers, teas by origin.</w:t>
+      </w:r>
+    </w:p>
+    <w:p>
+      <w:pPr>
+        <w:spacing w:after="140" w:line="288"/>
+        <w:jc w:val="both"/>
+      </w:pPr>
+      <w:r>
+        <w:rPr>
+          <w:b w:val="false"/>
+          <w:bCs w:val="false"/>
+          <w:i w:val="false"/>
+          <w:iCs w:val="false"/>
+          <w:sz w:val="21"/>
+          <w:szCs w:val="21"/>
+        </w:rPr>
+        <w:t xml:space="preserve">A narrower category, limited to twenty-eight main quotations, existed at first. It has been removed: it duplicated the other, and its automatic feed never succeeded. A complete category is worth more than a partial duplicate.</w:t>
+      </w:r>
+    </w:p>
+    <w:p>
+      <w:pPr>
+        <w:spacing w:after="140" w:line="288"/>
+        <w:jc w:val="both"/>
+      </w:pPr>
+      <w:r>
+        <w:rPr>
+          <w:b w:val="false"/>
+          <w:bCs w:val="false"/>
+          <w:i w:val="false"/>
+          <w:iCs w:val="false"/>
+          <w:sz w:val="21"/>
+          <w:szCs w:val="21"/>
+        </w:rPr>
+        <w:t xml:space="preserve">Fourteen series from the file are set aside on import. They are exchange rates, recognisable by their code, and have no place in a category of products. They remain available in the exchange rate category.</w:t>
       </w:r>
     </w:p>
     <w:p>
@@ -9179,2380 +9139,7 @@
           <w:sz w:val="21"/>
           <w:szCs w:val="21"/>
         </w:rPr>
-        <w:t xml:space="preserve">The tables below list the 341 active indicators by category. The collection code is the one used with the provider: it must not be altered. Unless stated otherwise the frequency is annual; commodity prices are monthly and also aggregated into annual averages.</w:t>
-      </w:r>
-    </w:p>
-    <w:p>
-      <w:pPr>
-        <w:pStyle w:val="Heading2"/>
-      </w:pPr>
-      <w:r>
-        <w:t xml:space="preserve">C01. Commodities</w:t>
-      </w:r>
-    </w:p>
-    <w:tbl>
-      <w:tblPr>
-        <w:tblW w:type="dxa" w:w="9354"/>
-        <w:tblBorders>
-          <w:top w:val="single" w:color="auto" w:sz="4"/>
-          <w:left w:val="single" w:color="auto" w:sz="4"/>
-          <w:bottom w:val="single" w:color="auto" w:sz="4"/>
-          <w:right w:val="single" w:color="auto" w:sz="4"/>
-          <w:insideH w:val="single" w:color="auto" w:sz="4"/>
-          <w:insideV w:val="single" w:color="auto" w:sz="4"/>
-        </w:tblBorders>
-      </w:tblPr>
-      <w:tblGrid>
-        <w:gridCol w:w="4300"/>
-        <w:gridCol w:w="2300"/>
-        <w:gridCol w:w="2754"/>
-      </w:tblGrid>
-      <w:tr>
-        <w:trPr>
-          <w:tblHeader/>
-        </w:trPr>
-        <w:tc>
-          <w:tcPr>
-            <w:tcW w:type="dxa" w:w="4300"/>
-            <w:shd w:fill="3A3A3A" w:color="auto" w:val="clear"/>
-            <w:tcMar>
-              <w:top w:type="dxa" w:w="24"/>
-              <w:left w:type="dxa" w:w="70"/>
-              <w:bottom w:type="dxa" w:w="24"/>
-              <w:right w:type="dxa" w:w="70"/>
-            </w:tcMar>
-          </w:tcPr>
-          <w:p>
-            <w:pPr>
-              <w:spacing w:after="0" w:line="200"/>
-              <w:jc w:val="left"/>
-            </w:pPr>
-            <w:r>
-              <w:rPr>
-                <w:b/>
-                <w:bCs/>
-                <w:color w:val="FFFFFF"/>
-                <w:sz w:val="15"/>
-                <w:szCs w:val="15"/>
-              </w:rPr>
-              <w:t xml:space="preserve">Indicator</w:t>
-            </w:r>
-          </w:p>
-        </w:tc>
-        <w:tc>
-          <w:tcPr>
-            <w:tcW w:type="dxa" w:w="2300"/>
-            <w:shd w:fill="3A3A3A" w:color="auto" w:val="clear"/>
-            <w:tcMar>
-              <w:top w:type="dxa" w:w="24"/>
-              <w:left w:type="dxa" w:w="70"/>
-              <w:bottom w:type="dxa" w:w="24"/>
-              <w:right w:type="dxa" w:w="70"/>
-            </w:tcMar>
-          </w:tcPr>
-          <w:p>
-            <w:pPr>
-              <w:spacing w:after="0" w:line="200"/>
-              <w:jc w:val="left"/>
-            </w:pPr>
-            <w:r>
-              <w:rPr>
-                <w:b/>
-                <w:bCs/>
-                <w:color w:val="FFFFFF"/>
-                <w:sz w:val="15"/>
-                <w:szCs w:val="15"/>
-              </w:rPr>
-              <w:t xml:space="preserve">Collection code</w:t>
-            </w:r>
-          </w:p>
-        </w:tc>
-        <w:tc>
-          <w:tcPr>
-            <w:tcW w:type="dxa" w:w="2754"/>
-            <w:shd w:fill="3A3A3A" w:color="auto" w:val="clear"/>
-            <w:tcMar>
-              <w:top w:type="dxa" w:w="24"/>
-              <w:left w:type="dxa" w:w="70"/>
-              <w:bottom w:type="dxa" w:w="24"/>
-              <w:right w:type="dxa" w:w="70"/>
-            </w:tcMar>
-          </w:tcPr>
-          <w:p>
-            <w:pPr>
-              <w:spacing w:after="0" w:line="200"/>
-              <w:jc w:val="left"/>
-            </w:pPr>
-            <w:r>
-              <w:rPr>
-                <w:b/>
-                <w:bCs/>
-                <w:color w:val="FFFFFF"/>
-                <w:sz w:val="15"/>
-                <w:szCs w:val="15"/>
-              </w:rPr>
-              <w:t xml:space="preserve">Unit</w:t>
-            </w:r>
-          </w:p>
-        </w:tc>
-      </w:tr>
-      <w:tr>
-        <w:tc>
-          <w:tcPr>
-            <w:tcW w:type="dxa" w:w="4300"/>
-            <w:tcMar>
-              <w:top w:type="dxa" w:w="24"/>
-              <w:left w:type="dxa" w:w="70"/>
-              <w:bottom w:type="dxa" w:w="24"/>
-              <w:right w:type="dxa" w:w="70"/>
-            </w:tcMar>
-          </w:tcPr>
-          <w:p>
-            <w:pPr>
-              <w:spacing w:after="0" w:line="200"/>
-              <w:jc w:val="left"/>
-            </w:pPr>
-            <w:r>
-              <w:rPr>
-                <w:color w:val="000000"/>
-                <w:sz w:val="15"/>
-                <w:szCs w:val="15"/>
-              </w:rPr>
-              <w:t xml:space="preserve">Aluminium</w:t>
-            </w:r>
-          </w:p>
-        </w:tc>
-        <w:tc>
-          <w:tcPr>
-            <w:tcW w:type="dxa" w:w="2300"/>
-            <w:tcMar>
-              <w:top w:type="dxa" w:w="24"/>
-              <w:left w:type="dxa" w:w="70"/>
-              <w:bottom w:type="dxa" w:w="24"/>
-              <w:right w:type="dxa" w:w="70"/>
-            </w:tcMar>
-          </w:tcPr>
-          <w:p>
-            <w:pPr>
-              <w:spacing w:after="0" w:line="200"/>
-              <w:jc w:val="left"/>
-            </w:pPr>
-            <w:r>
-              <w:rPr>
-                <w:rFonts w:ascii="Consolas" w:cs="Consolas" w:eastAsia="Consolas" w:hAnsi="Consolas"/>
-                <w:color w:val="000000"/>
-                <w:sz w:val="15"/>
-                <w:szCs w:val="15"/>
-              </w:rPr>
-              <w:t xml:space="preserve">PALUM</w:t>
-            </w:r>
-          </w:p>
-        </w:tc>
-        <w:tc>
-          <w:tcPr>
-            <w:tcW w:type="dxa" w:w="2754"/>
-            <w:tcMar>
-              <w:top w:type="dxa" w:w="24"/>
-              <w:left w:type="dxa" w:w="70"/>
-              <w:bottom w:type="dxa" w:w="24"/>
-              <w:right w:type="dxa" w:w="70"/>
-            </w:tcMar>
-          </w:tcPr>
-          <w:p>
-            <w:pPr>
-              <w:spacing w:after="0" w:line="200"/>
-              <w:jc w:val="left"/>
-            </w:pPr>
-            <w:r>
-              <w:rPr>
-                <w:color w:val="000000"/>
-                <w:sz w:val="15"/>
-                <w:szCs w:val="15"/>
-              </w:rPr>
-              <w:t xml:space="preserve">USD / tonne</w:t>
-            </w:r>
-          </w:p>
-        </w:tc>
-      </w:tr>
-      <w:tr>
-        <w:tc>
-          <w:tcPr>
-            <w:tcW w:type="dxa" w:w="4300"/>
-            <w:shd w:fill="F2F2F2" w:color="auto" w:val="clear"/>
-            <w:tcMar>
-              <w:top w:type="dxa" w:w="24"/>
-              <w:left w:type="dxa" w:w="70"/>
-              <w:bottom w:type="dxa" w:w="24"/>
-              <w:right w:type="dxa" w:w="70"/>
-            </w:tcMar>
-          </w:tcPr>
-          <w:p>
-            <w:pPr>
-              <w:spacing w:after="0" w:line="200"/>
-              <w:jc w:val="left"/>
-            </w:pPr>
-            <w:r>
-              <w:rPr>
-                <w:color w:val="000000"/>
-                <w:sz w:val="15"/>
-                <w:szCs w:val="15"/>
-              </w:rPr>
-              <w:t xml:space="preserve">Bananas</w:t>
-            </w:r>
-          </w:p>
-        </w:tc>
-        <w:tc>
-          <w:tcPr>
-            <w:tcW w:type="dxa" w:w="2300"/>
-            <w:shd w:fill="F2F2F2" w:color="auto" w:val="clear"/>
-            <w:tcMar>
-              <w:top w:type="dxa" w:w="24"/>
-              <w:left w:type="dxa" w:w="70"/>
-              <w:bottom w:type="dxa" w:w="24"/>
-              <w:right w:type="dxa" w:w="70"/>
-            </w:tcMar>
-          </w:tcPr>
-          <w:p>
-            <w:pPr>
-              <w:spacing w:after="0" w:line="200"/>
-              <w:jc w:val="left"/>
-            </w:pPr>
-            <w:r>
-              <w:rPr>
-                <w:rFonts w:ascii="Consolas" w:cs="Consolas" w:eastAsia="Consolas" w:hAnsi="Consolas"/>
-                <w:color w:val="000000"/>
-                <w:sz w:val="15"/>
-                <w:szCs w:val="15"/>
-              </w:rPr>
-              <w:t xml:space="preserve">PBANSOP</w:t>
-            </w:r>
-          </w:p>
-        </w:tc>
-        <w:tc>
-          <w:tcPr>
-            <w:tcW w:type="dxa" w:w="2754"/>
-            <w:shd w:fill="F2F2F2" w:color="auto" w:val="clear"/>
-            <w:tcMar>
-              <w:top w:type="dxa" w:w="24"/>
-              <w:left w:type="dxa" w:w="70"/>
-              <w:bottom w:type="dxa" w:w="24"/>
-              <w:right w:type="dxa" w:w="70"/>
-            </w:tcMar>
-          </w:tcPr>
-          <w:p>
-            <w:pPr>
-              <w:spacing w:after="0" w:line="200"/>
-              <w:jc w:val="left"/>
-            </w:pPr>
-            <w:r>
-              <w:rPr>
-                <w:color w:val="000000"/>
-                <w:sz w:val="15"/>
-                <w:szCs w:val="15"/>
-              </w:rPr>
-              <w:t xml:space="preserve">USD / tonne</w:t>
-            </w:r>
-          </w:p>
-        </w:tc>
-      </w:tr>
-      <w:tr>
-        <w:tc>
-          <w:tcPr>
-            <w:tcW w:type="dxa" w:w="4300"/>
-            <w:tcMar>
-              <w:top w:type="dxa" w:w="24"/>
-              <w:left w:type="dxa" w:w="70"/>
-              <w:bottom w:type="dxa" w:w="24"/>
-              <w:right w:type="dxa" w:w="70"/>
-            </w:tcMar>
-          </w:tcPr>
-          <w:p>
-            <w:pPr>
-              <w:spacing w:after="0" w:line="200"/>
-              <w:jc w:val="left"/>
-            </w:pPr>
-            <w:r>
-              <w:rPr>
-                <w:color w:val="000000"/>
-                <w:sz w:val="15"/>
-                <w:szCs w:val="15"/>
-              </w:rPr>
-              <w:t xml:space="preserve">Wheat</w:t>
-            </w:r>
-          </w:p>
-        </w:tc>
-        <w:tc>
-          <w:tcPr>
-            <w:tcW w:type="dxa" w:w="2300"/>
-            <w:tcMar>
-              <w:top w:type="dxa" w:w="24"/>
-              <w:left w:type="dxa" w:w="70"/>
-              <w:bottom w:type="dxa" w:w="24"/>
-              <w:right w:type="dxa" w:w="70"/>
-            </w:tcMar>
-          </w:tcPr>
-          <w:p>
-            <w:pPr>
-              <w:spacing w:after="0" w:line="200"/>
-              <w:jc w:val="left"/>
-            </w:pPr>
-            <w:r>
-              <w:rPr>
-                <w:rFonts w:ascii="Consolas" w:cs="Consolas" w:eastAsia="Consolas" w:hAnsi="Consolas"/>
-                <w:color w:val="000000"/>
-                <w:sz w:val="15"/>
-                <w:szCs w:val="15"/>
-              </w:rPr>
-              <w:t xml:space="preserve">PWHEAMT</w:t>
-            </w:r>
-          </w:p>
-        </w:tc>
-        <w:tc>
-          <w:tcPr>
-            <w:tcW w:type="dxa" w:w="2754"/>
-            <w:tcMar>
-              <w:top w:type="dxa" w:w="24"/>
-              <w:left w:type="dxa" w:w="70"/>
-              <w:bottom w:type="dxa" w:w="24"/>
-              <w:right w:type="dxa" w:w="70"/>
-            </w:tcMar>
-          </w:tcPr>
-          <w:p>
-            <w:pPr>
-              <w:spacing w:after="0" w:line="200"/>
-              <w:jc w:val="left"/>
-            </w:pPr>
-            <w:r>
-              <w:rPr>
-                <w:color w:val="000000"/>
-                <w:sz w:val="15"/>
-                <w:szCs w:val="15"/>
-              </w:rPr>
-              <w:t xml:space="preserve">USD / tonne</w:t>
-            </w:r>
-          </w:p>
-        </w:tc>
-      </w:tr>
-      <w:tr>
-        <w:tc>
-          <w:tcPr>
-            <w:tcW w:type="dxa" w:w="4300"/>
-            <w:shd w:fill="F2F2F2" w:color="auto" w:val="clear"/>
-            <w:tcMar>
-              <w:top w:type="dxa" w:w="24"/>
-              <w:left w:type="dxa" w:w="70"/>
-              <w:bottom w:type="dxa" w:w="24"/>
-              <w:right w:type="dxa" w:w="70"/>
-            </w:tcMar>
-          </w:tcPr>
-          <w:p>
-            <w:pPr>
-              <w:spacing w:after="0" w:line="200"/>
-              <w:jc w:val="left"/>
-            </w:pPr>
-            <w:r>
-              <w:rPr>
-                <w:color w:val="000000"/>
-                <w:sz w:val="15"/>
-                <w:szCs w:val="15"/>
-              </w:rPr>
-              <w:t xml:space="preserve">Cocoa</w:t>
-            </w:r>
-          </w:p>
-        </w:tc>
-        <w:tc>
-          <w:tcPr>
-            <w:tcW w:type="dxa" w:w="2300"/>
-            <w:shd w:fill="F2F2F2" w:color="auto" w:val="clear"/>
-            <w:tcMar>
-              <w:top w:type="dxa" w:w="24"/>
-              <w:left w:type="dxa" w:w="70"/>
-              <w:bottom w:type="dxa" w:w="24"/>
-              <w:right w:type="dxa" w:w="70"/>
-            </w:tcMar>
-          </w:tcPr>
-          <w:p>
-            <w:pPr>
-              <w:spacing w:after="0" w:line="200"/>
-              <w:jc w:val="left"/>
-            </w:pPr>
-            <w:r>
-              <w:rPr>
-                <w:rFonts w:ascii="Consolas" w:cs="Consolas" w:eastAsia="Consolas" w:hAnsi="Consolas"/>
-                <w:color w:val="000000"/>
-                <w:sz w:val="15"/>
-                <w:szCs w:val="15"/>
-              </w:rPr>
-              <w:t xml:space="preserve">PCOCO</w:t>
-            </w:r>
-          </w:p>
-        </w:tc>
-        <w:tc>
-          <w:tcPr>
-            <w:tcW w:type="dxa" w:w="2754"/>
-            <w:shd w:fill="F2F2F2" w:color="auto" w:val="clear"/>
-            <w:tcMar>
-              <w:top w:type="dxa" w:w="24"/>
-              <w:left w:type="dxa" w:w="70"/>
-              <w:bottom w:type="dxa" w:w="24"/>
-              <w:right w:type="dxa" w:w="70"/>
-            </w:tcMar>
-          </w:tcPr>
-          <w:p>
-            <w:pPr>
-              <w:spacing w:after="0" w:line="200"/>
-              <w:jc w:val="left"/>
-            </w:pPr>
-            <w:r>
-              <w:rPr>
-                <w:color w:val="000000"/>
-                <w:sz w:val="15"/>
-                <w:szCs w:val="15"/>
-              </w:rPr>
-              <w:t xml:space="preserve">USD / tonne</w:t>
-            </w:r>
-          </w:p>
-        </w:tc>
-      </w:tr>
-      <w:tr>
-        <w:tc>
-          <w:tcPr>
-            <w:tcW w:type="dxa" w:w="4300"/>
-            <w:tcMar>
-              <w:top w:type="dxa" w:w="24"/>
-              <w:left w:type="dxa" w:w="70"/>
-              <w:bottom w:type="dxa" w:w="24"/>
-              <w:right w:type="dxa" w:w="70"/>
-            </w:tcMar>
-          </w:tcPr>
-          <w:p>
-            <w:pPr>
-              <w:spacing w:after="0" w:line="200"/>
-              <w:jc w:val="left"/>
-            </w:pPr>
-            <w:r>
-              <w:rPr>
-                <w:color w:val="000000"/>
-                <w:sz w:val="15"/>
-                <w:szCs w:val="15"/>
-              </w:rPr>
-              <w:t xml:space="preserve">Coffee, Arabica</w:t>
-            </w:r>
-          </w:p>
-        </w:tc>
-        <w:tc>
-          <w:tcPr>
-            <w:tcW w:type="dxa" w:w="2300"/>
-            <w:tcMar>
-              <w:top w:type="dxa" w:w="24"/>
-              <w:left w:type="dxa" w:w="70"/>
-              <w:bottom w:type="dxa" w:w="24"/>
-              <w:right w:type="dxa" w:w="70"/>
-            </w:tcMar>
-          </w:tcPr>
-          <w:p>
-            <w:pPr>
-              <w:spacing w:after="0" w:line="200"/>
-              <w:jc w:val="left"/>
-            </w:pPr>
-            <w:r>
-              <w:rPr>
-                <w:rFonts w:ascii="Consolas" w:cs="Consolas" w:eastAsia="Consolas" w:hAnsi="Consolas"/>
-                <w:color w:val="000000"/>
-                <w:sz w:val="15"/>
-                <w:szCs w:val="15"/>
-              </w:rPr>
-              <w:t xml:space="preserve">PCOFFOTM</w:t>
-            </w:r>
-          </w:p>
-        </w:tc>
-        <w:tc>
-          <w:tcPr>
-            <w:tcW w:type="dxa" w:w="2754"/>
-            <w:tcMar>
-              <w:top w:type="dxa" w:w="24"/>
-              <w:left w:type="dxa" w:w="70"/>
-              <w:bottom w:type="dxa" w:w="24"/>
-              <w:right w:type="dxa" w:w="70"/>
-            </w:tcMar>
-          </w:tcPr>
-          <w:p>
-            <w:pPr>
-              <w:spacing w:after="0" w:line="200"/>
-              <w:jc w:val="left"/>
-            </w:pPr>
-            <w:r>
-              <w:rPr>
-                <w:color w:val="000000"/>
-                <w:sz w:val="15"/>
-                <w:szCs w:val="15"/>
-              </w:rPr>
-              <w:t xml:space="preserve">cents US / livre</w:t>
-            </w:r>
-          </w:p>
-        </w:tc>
-      </w:tr>
-      <w:tr>
-        <w:tc>
-          <w:tcPr>
-            <w:tcW w:type="dxa" w:w="4300"/>
-            <w:shd w:fill="F2F2F2" w:color="auto" w:val="clear"/>
-            <w:tcMar>
-              <w:top w:type="dxa" w:w="24"/>
-              <w:left w:type="dxa" w:w="70"/>
-              <w:bottom w:type="dxa" w:w="24"/>
-              <w:right w:type="dxa" w:w="70"/>
-            </w:tcMar>
-          </w:tcPr>
-          <w:p>
-            <w:pPr>
-              <w:spacing w:after="0" w:line="200"/>
-              <w:jc w:val="left"/>
-            </w:pPr>
-            <w:r>
-              <w:rPr>
-                <w:color w:val="000000"/>
-                <w:sz w:val="15"/>
-                <w:szCs w:val="15"/>
-              </w:rPr>
-              <w:t xml:space="preserve">Coffee, Robusta</w:t>
-            </w:r>
-          </w:p>
-        </w:tc>
-        <w:tc>
-          <w:tcPr>
-            <w:tcW w:type="dxa" w:w="2300"/>
-            <w:shd w:fill="F2F2F2" w:color="auto" w:val="clear"/>
-            <w:tcMar>
-              <w:top w:type="dxa" w:w="24"/>
-              <w:left w:type="dxa" w:w="70"/>
-              <w:bottom w:type="dxa" w:w="24"/>
-              <w:right w:type="dxa" w:w="70"/>
-            </w:tcMar>
-          </w:tcPr>
-          <w:p>
-            <w:pPr>
-              <w:spacing w:after="0" w:line="200"/>
-              <w:jc w:val="left"/>
-            </w:pPr>
-            <w:r>
-              <w:rPr>
-                <w:rFonts w:ascii="Consolas" w:cs="Consolas" w:eastAsia="Consolas" w:hAnsi="Consolas"/>
-                <w:color w:val="000000"/>
-                <w:sz w:val="15"/>
-                <w:szCs w:val="15"/>
-              </w:rPr>
-              <w:t xml:space="preserve">PCOFFROB</w:t>
-            </w:r>
-          </w:p>
-        </w:tc>
-        <w:tc>
-          <w:tcPr>
-            <w:tcW w:type="dxa" w:w="2754"/>
-            <w:shd w:fill="F2F2F2" w:color="auto" w:val="clear"/>
-            <w:tcMar>
-              <w:top w:type="dxa" w:w="24"/>
-              <w:left w:type="dxa" w:w="70"/>
-              <w:bottom w:type="dxa" w:w="24"/>
-              <w:right w:type="dxa" w:w="70"/>
-            </w:tcMar>
-          </w:tcPr>
-          <w:p>
-            <w:pPr>
-              <w:spacing w:after="0" w:line="200"/>
-              <w:jc w:val="left"/>
-            </w:pPr>
-            <w:r>
-              <w:rPr>
-                <w:color w:val="000000"/>
-                <w:sz w:val="15"/>
-                <w:szCs w:val="15"/>
-              </w:rPr>
-              <w:t xml:space="preserve">cents US / livre</w:t>
-            </w:r>
-          </w:p>
-        </w:tc>
-      </w:tr>
-      <w:tr>
-        <w:tc>
-          <w:tcPr>
-            <w:tcW w:type="dxa" w:w="4300"/>
-            <w:tcMar>
-              <w:top w:type="dxa" w:w="24"/>
-              <w:left w:type="dxa" w:w="70"/>
-              <w:bottom w:type="dxa" w:w="24"/>
-              <w:right w:type="dxa" w:w="70"/>
-            </w:tcMar>
-          </w:tcPr>
-          <w:p>
-            <w:pPr>
-              <w:spacing w:after="0" w:line="200"/>
-              <w:jc w:val="left"/>
-            </w:pPr>
-            <w:r>
-              <w:rPr>
-                <w:color w:val="000000"/>
-                <w:sz w:val="15"/>
-                <w:szCs w:val="15"/>
-              </w:rPr>
-              <w:t xml:space="preserve">Rubber</w:t>
-            </w:r>
-          </w:p>
-        </w:tc>
-        <w:tc>
-          <w:tcPr>
-            <w:tcW w:type="dxa" w:w="2300"/>
-            <w:tcMar>
-              <w:top w:type="dxa" w:w="24"/>
-              <w:left w:type="dxa" w:w="70"/>
-              <w:bottom w:type="dxa" w:w="24"/>
-              <w:right w:type="dxa" w:w="70"/>
-            </w:tcMar>
-          </w:tcPr>
-          <w:p>
-            <w:pPr>
-              <w:spacing w:after="0" w:line="200"/>
-              <w:jc w:val="left"/>
-            </w:pPr>
-            <w:r>
-              <w:rPr>
-                <w:rFonts w:ascii="Consolas" w:cs="Consolas" w:eastAsia="Consolas" w:hAnsi="Consolas"/>
-                <w:color w:val="000000"/>
-                <w:sz w:val="15"/>
-                <w:szCs w:val="15"/>
-              </w:rPr>
-              <w:t xml:space="preserve">PRUBB</w:t>
-            </w:r>
-          </w:p>
-        </w:tc>
-        <w:tc>
-          <w:tcPr>
-            <w:tcW w:type="dxa" w:w="2754"/>
-            <w:tcMar>
-              <w:top w:type="dxa" w:w="24"/>
-              <w:left w:type="dxa" w:w="70"/>
-              <w:bottom w:type="dxa" w:w="24"/>
-              <w:right w:type="dxa" w:w="70"/>
-            </w:tcMar>
-          </w:tcPr>
-          <w:p>
-            <w:pPr>
-              <w:spacing w:after="0" w:line="200"/>
-              <w:jc w:val="left"/>
-            </w:pPr>
-            <w:r>
-              <w:rPr>
-                <w:color w:val="000000"/>
-                <w:sz w:val="15"/>
-                <w:szCs w:val="15"/>
-              </w:rPr>
-              <w:t xml:space="preserve">cents US / livre</w:t>
-            </w:r>
-          </w:p>
-        </w:tc>
-      </w:tr>
-      <w:tr>
-        <w:tc>
-          <w:tcPr>
-            <w:tcW w:type="dxa" w:w="4300"/>
-            <w:shd w:fill="F2F2F2" w:color="auto" w:val="clear"/>
-            <w:tcMar>
-              <w:top w:type="dxa" w:w="24"/>
-              <w:left w:type="dxa" w:w="70"/>
-              <w:bottom w:type="dxa" w:w="24"/>
-              <w:right w:type="dxa" w:w="70"/>
-            </w:tcMar>
-          </w:tcPr>
-          <w:p>
-            <w:pPr>
-              <w:spacing w:after="0" w:line="200"/>
-              <w:jc w:val="left"/>
-            </w:pPr>
-            <w:r>
-              <w:rPr>
-                <w:color w:val="000000"/>
-                <w:sz w:val="15"/>
-                <w:szCs w:val="15"/>
-              </w:rPr>
-              <w:t xml:space="preserve">Coal, Australia</w:t>
-            </w:r>
-          </w:p>
-        </w:tc>
-        <w:tc>
-          <w:tcPr>
-            <w:tcW w:type="dxa" w:w="2300"/>
-            <w:shd w:fill="F2F2F2" w:color="auto" w:val="clear"/>
-            <w:tcMar>
-              <w:top w:type="dxa" w:w="24"/>
-              <w:left w:type="dxa" w:w="70"/>
-              <w:bottom w:type="dxa" w:w="24"/>
-              <w:right w:type="dxa" w:w="70"/>
-            </w:tcMar>
-          </w:tcPr>
-          <w:p>
-            <w:pPr>
-              <w:spacing w:after="0" w:line="200"/>
-              <w:jc w:val="left"/>
-            </w:pPr>
-            <w:r>
-              <w:rPr>
-                <w:rFonts w:ascii="Consolas" w:cs="Consolas" w:eastAsia="Consolas" w:hAnsi="Consolas"/>
-                <w:color w:val="000000"/>
-                <w:sz w:val="15"/>
-                <w:szCs w:val="15"/>
-              </w:rPr>
-              <w:t xml:space="preserve">PCOALAU</w:t>
-            </w:r>
-          </w:p>
-        </w:tc>
-        <w:tc>
-          <w:tcPr>
-            <w:tcW w:type="dxa" w:w="2754"/>
-            <w:shd w:fill="F2F2F2" w:color="auto" w:val="clear"/>
-            <w:tcMar>
-              <w:top w:type="dxa" w:w="24"/>
-              <w:left w:type="dxa" w:w="70"/>
-              <w:bottom w:type="dxa" w:w="24"/>
-              <w:right w:type="dxa" w:w="70"/>
-            </w:tcMar>
-          </w:tcPr>
-          <w:p>
-            <w:pPr>
-              <w:spacing w:after="0" w:line="200"/>
-              <w:jc w:val="left"/>
-            </w:pPr>
-            <w:r>
-              <w:rPr>
-                <w:color w:val="000000"/>
-                <w:sz w:val="15"/>
-                <w:szCs w:val="15"/>
-              </w:rPr>
-              <w:t xml:space="preserve">USD / tonne</w:t>
-            </w:r>
-          </w:p>
-        </w:tc>
-      </w:tr>
-      <w:tr>
-        <w:tc>
-          <w:tcPr>
-            <w:tcW w:type="dxa" w:w="4300"/>
-            <w:tcMar>
-              <w:top w:type="dxa" w:w="24"/>
-              <w:left w:type="dxa" w:w="70"/>
-              <w:bottom w:type="dxa" w:w="24"/>
-              <w:right w:type="dxa" w:w="70"/>
-            </w:tcMar>
-          </w:tcPr>
-          <w:p>
-            <w:pPr>
-              <w:spacing w:after="0" w:line="200"/>
-              <w:jc w:val="left"/>
-            </w:pPr>
-            <w:r>
-              <w:rPr>
-                <w:color w:val="000000"/>
-                <w:sz w:val="15"/>
-                <w:szCs w:val="15"/>
-              </w:rPr>
-              <w:t xml:space="preserve">Cotton</w:t>
-            </w:r>
-          </w:p>
-        </w:tc>
-        <w:tc>
-          <w:tcPr>
-            <w:tcW w:type="dxa" w:w="2300"/>
-            <w:tcMar>
-              <w:top w:type="dxa" w:w="24"/>
-              <w:left w:type="dxa" w:w="70"/>
-              <w:bottom w:type="dxa" w:w="24"/>
-              <w:right w:type="dxa" w:w="70"/>
-            </w:tcMar>
-          </w:tcPr>
-          <w:p>
-            <w:pPr>
-              <w:spacing w:after="0" w:line="200"/>
-              <w:jc w:val="left"/>
-            </w:pPr>
-            <w:r>
-              <w:rPr>
-                <w:rFonts w:ascii="Consolas" w:cs="Consolas" w:eastAsia="Consolas" w:hAnsi="Consolas"/>
-                <w:color w:val="000000"/>
-                <w:sz w:val="15"/>
-                <w:szCs w:val="15"/>
-              </w:rPr>
-              <w:t xml:space="preserve">PCOTTIND</w:t>
-            </w:r>
-          </w:p>
-        </w:tc>
-        <w:tc>
-          <w:tcPr>
-            <w:tcW w:type="dxa" w:w="2754"/>
-            <w:tcMar>
-              <w:top w:type="dxa" w:w="24"/>
-              <w:left w:type="dxa" w:w="70"/>
-              <w:bottom w:type="dxa" w:w="24"/>
-              <w:right w:type="dxa" w:w="70"/>
-            </w:tcMar>
-          </w:tcPr>
-          <w:p>
-            <w:pPr>
-              <w:spacing w:after="0" w:line="200"/>
-              <w:jc w:val="left"/>
-            </w:pPr>
-            <w:r>
-              <w:rPr>
-                <w:color w:val="000000"/>
-                <w:sz w:val="15"/>
-                <w:szCs w:val="15"/>
-              </w:rPr>
-              <w:t xml:space="preserve">cents US / livre</w:t>
-            </w:r>
-          </w:p>
-        </w:tc>
-      </w:tr>
-      <w:tr>
-        <w:tc>
-          <w:tcPr>
-            <w:tcW w:type="dxa" w:w="4300"/>
-            <w:shd w:fill="F2F2F2" w:color="auto" w:val="clear"/>
-            <w:tcMar>
-              <w:top w:type="dxa" w:w="24"/>
-              <w:left w:type="dxa" w:w="70"/>
-              <w:bottom w:type="dxa" w:w="24"/>
-              <w:right w:type="dxa" w:w="70"/>
-            </w:tcMar>
-          </w:tcPr>
-          <w:p>
-            <w:pPr>
-              <w:spacing w:after="0" w:line="200"/>
-              <w:jc w:val="left"/>
-            </w:pPr>
-            <w:r>
-              <w:rPr>
-                <w:color w:val="000000"/>
-                <w:sz w:val="15"/>
-                <w:szCs w:val="15"/>
-              </w:rPr>
-              <w:t xml:space="preserve">Crude oil, average</w:t>
-            </w:r>
-          </w:p>
-        </w:tc>
-        <w:tc>
-          <w:tcPr>
-            <w:tcW w:type="dxa" w:w="2300"/>
-            <w:shd w:fill="F2F2F2" w:color="auto" w:val="clear"/>
-            <w:tcMar>
-              <w:top w:type="dxa" w:w="24"/>
-              <w:left w:type="dxa" w:w="70"/>
-              <w:bottom w:type="dxa" w:w="24"/>
-              <w:right w:type="dxa" w:w="70"/>
-            </w:tcMar>
-          </w:tcPr>
-          <w:p>
-            <w:pPr>
-              <w:spacing w:after="0" w:line="200"/>
-              <w:jc w:val="left"/>
-            </w:pPr>
-            <w:r>
-              <w:rPr>
-                <w:rFonts w:ascii="Consolas" w:cs="Consolas" w:eastAsia="Consolas" w:hAnsi="Consolas"/>
-                <w:color w:val="000000"/>
-                <w:sz w:val="15"/>
-                <w:szCs w:val="15"/>
-              </w:rPr>
-              <w:t xml:space="preserve">POILAPSP</w:t>
-            </w:r>
-          </w:p>
-        </w:tc>
-        <w:tc>
-          <w:tcPr>
-            <w:tcW w:type="dxa" w:w="2754"/>
-            <w:shd w:fill="F2F2F2" w:color="auto" w:val="clear"/>
-            <w:tcMar>
-              <w:top w:type="dxa" w:w="24"/>
-              <w:left w:type="dxa" w:w="70"/>
-              <w:bottom w:type="dxa" w:w="24"/>
-              <w:right w:type="dxa" w:w="70"/>
-            </w:tcMar>
-          </w:tcPr>
-          <w:p>
-            <w:pPr>
-              <w:spacing w:after="0" w:line="200"/>
-              <w:jc w:val="left"/>
-            </w:pPr>
-            <w:r>
-              <w:rPr>
-                <w:color w:val="000000"/>
-                <w:sz w:val="15"/>
-                <w:szCs w:val="15"/>
-              </w:rPr>
-              <w:t xml:space="preserve">USD / baril</w:t>
-            </w:r>
-          </w:p>
-        </w:tc>
-      </w:tr>
-      <w:tr>
-        <w:tc>
-          <w:tcPr>
-            <w:tcW w:type="dxa" w:w="4300"/>
-            <w:tcMar>
-              <w:top w:type="dxa" w:w="24"/>
-              <w:left w:type="dxa" w:w="70"/>
-              <w:bottom w:type="dxa" w:w="24"/>
-              <w:right w:type="dxa" w:w="70"/>
-            </w:tcMar>
-          </w:tcPr>
-          <w:p>
-            <w:pPr>
-              <w:spacing w:after="0" w:line="200"/>
-              <w:jc w:val="left"/>
-            </w:pPr>
-            <w:r>
-              <w:rPr>
-                <w:color w:val="000000"/>
-                <w:sz w:val="15"/>
-                <w:szCs w:val="15"/>
-              </w:rPr>
-              <w:t xml:space="preserve">Copper</w:t>
-            </w:r>
-          </w:p>
-        </w:tc>
-        <w:tc>
-          <w:tcPr>
-            <w:tcW w:type="dxa" w:w="2300"/>
-            <w:tcMar>
-              <w:top w:type="dxa" w:w="24"/>
-              <w:left w:type="dxa" w:w="70"/>
-              <w:bottom w:type="dxa" w:w="24"/>
-              <w:right w:type="dxa" w:w="70"/>
-            </w:tcMar>
-          </w:tcPr>
-          <w:p>
-            <w:pPr>
-              <w:spacing w:after="0" w:line="200"/>
-              <w:jc w:val="left"/>
-            </w:pPr>
-            <w:r>
-              <w:rPr>
-                <w:rFonts w:ascii="Consolas" w:cs="Consolas" w:eastAsia="Consolas" w:hAnsi="Consolas"/>
-                <w:color w:val="000000"/>
-                <w:sz w:val="15"/>
-                <w:szCs w:val="15"/>
-              </w:rPr>
-              <w:t xml:space="preserve">PCOPP</w:t>
-            </w:r>
-          </w:p>
-        </w:tc>
-        <w:tc>
-          <w:tcPr>
-            <w:tcW w:type="dxa" w:w="2754"/>
-            <w:tcMar>
-              <w:top w:type="dxa" w:w="24"/>
-              <w:left w:type="dxa" w:w="70"/>
-              <w:bottom w:type="dxa" w:w="24"/>
-              <w:right w:type="dxa" w:w="70"/>
-            </w:tcMar>
-          </w:tcPr>
-          <w:p>
-            <w:pPr>
-              <w:spacing w:after="0" w:line="200"/>
-              <w:jc w:val="left"/>
-            </w:pPr>
-            <w:r>
-              <w:rPr>
-                <w:color w:val="000000"/>
-                <w:sz w:val="15"/>
-                <w:szCs w:val="15"/>
-              </w:rPr>
-              <w:t xml:space="preserve">USD / tonne</w:t>
-            </w:r>
-          </w:p>
-        </w:tc>
-      </w:tr>
-      <w:tr>
-        <w:tc>
-          <w:tcPr>
-            <w:tcW w:type="dxa" w:w="4300"/>
-            <w:shd w:fill="F2F2F2" w:color="auto" w:val="clear"/>
-            <w:tcMar>
-              <w:top w:type="dxa" w:w="24"/>
-              <w:left w:type="dxa" w:w="70"/>
-              <w:bottom w:type="dxa" w:w="24"/>
-              <w:right w:type="dxa" w:w="70"/>
-            </w:tcMar>
-          </w:tcPr>
-          <w:p>
-            <w:pPr>
-              <w:spacing w:after="0" w:line="200"/>
-              <w:jc w:val="left"/>
-            </w:pPr>
-            <w:r>
-              <w:rPr>
-                <w:color w:val="000000"/>
-                <w:sz w:val="15"/>
-                <w:szCs w:val="15"/>
-              </w:rPr>
-              <w:t xml:space="preserve">Natural gas, Europe</w:t>
-            </w:r>
-          </w:p>
-        </w:tc>
-        <w:tc>
-          <w:tcPr>
-            <w:tcW w:type="dxa" w:w="2300"/>
-            <w:shd w:fill="F2F2F2" w:color="auto" w:val="clear"/>
-            <w:tcMar>
-              <w:top w:type="dxa" w:w="24"/>
-              <w:left w:type="dxa" w:w="70"/>
-              <w:bottom w:type="dxa" w:w="24"/>
-              <w:right w:type="dxa" w:w="70"/>
-            </w:tcMar>
-          </w:tcPr>
-          <w:p>
-            <w:pPr>
-              <w:spacing w:after="0" w:line="200"/>
-              <w:jc w:val="left"/>
-            </w:pPr>
-            <w:r>
-              <w:rPr>
-                <w:rFonts w:ascii="Consolas" w:cs="Consolas" w:eastAsia="Consolas" w:hAnsi="Consolas"/>
-                <w:color w:val="000000"/>
-                <w:sz w:val="15"/>
-                <w:szCs w:val="15"/>
-              </w:rPr>
-              <w:t xml:space="preserve">PNGASEU</w:t>
-            </w:r>
-          </w:p>
-        </w:tc>
-        <w:tc>
-          <w:tcPr>
-            <w:tcW w:type="dxa" w:w="2754"/>
-            <w:shd w:fill="F2F2F2" w:color="auto" w:val="clear"/>
-            <w:tcMar>
-              <w:top w:type="dxa" w:w="24"/>
-              <w:left w:type="dxa" w:w="70"/>
-              <w:bottom w:type="dxa" w:w="24"/>
-              <w:right w:type="dxa" w:w="70"/>
-            </w:tcMar>
-          </w:tcPr>
-          <w:p>
-            <w:pPr>
-              <w:spacing w:after="0" w:line="200"/>
-              <w:jc w:val="left"/>
-            </w:pPr>
-            <w:r>
-              <w:rPr>
-                <w:color w:val="000000"/>
-                <w:sz w:val="15"/>
-                <w:szCs w:val="15"/>
-              </w:rPr>
-              <w:t xml:space="preserve">USD / MBtu</w:t>
-            </w:r>
-          </w:p>
-        </w:tc>
-      </w:tr>
-      <w:tr>
-        <w:tc>
-          <w:tcPr>
-            <w:tcW w:type="dxa" w:w="4300"/>
-            <w:tcMar>
-              <w:top w:type="dxa" w:w="24"/>
-              <w:left w:type="dxa" w:w="70"/>
-              <w:bottom w:type="dxa" w:w="24"/>
-              <w:right w:type="dxa" w:w="70"/>
-            </w:tcMar>
-          </w:tcPr>
-          <w:p>
-            <w:pPr>
-              <w:spacing w:after="0" w:line="200"/>
-              <w:jc w:val="left"/>
-            </w:pPr>
-            <w:r>
-              <w:rPr>
-                <w:color w:val="000000"/>
-                <w:sz w:val="15"/>
-                <w:szCs w:val="15"/>
-              </w:rPr>
-              <w:t xml:space="preserve">Logs, Cameroon</w:t>
-            </w:r>
-          </w:p>
-        </w:tc>
-        <w:tc>
-          <w:tcPr>
-            <w:tcW w:type="dxa" w:w="2300"/>
-            <w:tcMar>
-              <w:top w:type="dxa" w:w="24"/>
-              <w:left w:type="dxa" w:w="70"/>
-              <w:bottom w:type="dxa" w:w="24"/>
-              <w:right w:type="dxa" w:w="70"/>
-            </w:tcMar>
-          </w:tcPr>
-          <w:p>
-            <w:pPr>
-              <w:spacing w:after="0" w:line="200"/>
-              <w:jc w:val="left"/>
-            </w:pPr>
-            <w:r>
-              <w:rPr>
-                <w:rFonts w:ascii="Consolas" w:cs="Consolas" w:eastAsia="Consolas" w:hAnsi="Consolas"/>
-                <w:color w:val="000000"/>
-                <w:sz w:val="15"/>
-                <w:szCs w:val="15"/>
-              </w:rPr>
-              <w:t xml:space="preserve">PLOGSK</w:t>
-            </w:r>
-          </w:p>
-        </w:tc>
-        <w:tc>
-          <w:tcPr>
-            <w:tcW w:type="dxa" w:w="2754"/>
-            <w:tcMar>
-              <w:top w:type="dxa" w:w="24"/>
-              <w:left w:type="dxa" w:w="70"/>
-              <w:bottom w:type="dxa" w:w="24"/>
-              <w:right w:type="dxa" w:w="70"/>
-            </w:tcMar>
-          </w:tcPr>
-          <w:p>
-            <w:pPr>
-              <w:spacing w:after="0" w:line="200"/>
-              <w:jc w:val="left"/>
-            </w:pPr>
-            <w:r>
-              <w:rPr>
-                <w:color w:val="000000"/>
-                <w:sz w:val="15"/>
-                <w:szCs w:val="15"/>
-              </w:rPr>
-              <w:t xml:space="preserve">USD / m3</w:t>
-            </w:r>
-          </w:p>
-        </w:tc>
-      </w:tr>
-      <w:tr>
-        <w:tc>
-          <w:tcPr>
-            <w:tcW w:type="dxa" w:w="4300"/>
-            <w:shd w:fill="F2F2F2" w:color="auto" w:val="clear"/>
-            <w:tcMar>
-              <w:top w:type="dxa" w:w="24"/>
-              <w:left w:type="dxa" w:w="70"/>
-              <w:bottom w:type="dxa" w:w="24"/>
-              <w:right w:type="dxa" w:w="70"/>
-            </w:tcMar>
-          </w:tcPr>
-          <w:p>
-            <w:pPr>
-              <w:spacing w:after="0" w:line="200"/>
-              <w:jc w:val="left"/>
-            </w:pPr>
-            <w:r>
-              <w:rPr>
-                <w:color w:val="000000"/>
-                <w:sz w:val="15"/>
-                <w:szCs w:val="15"/>
-              </w:rPr>
-              <w:t xml:space="preserve">Palm oil</w:t>
-            </w:r>
-          </w:p>
-        </w:tc>
-        <w:tc>
-          <w:tcPr>
-            <w:tcW w:type="dxa" w:w="2300"/>
-            <w:shd w:fill="F2F2F2" w:color="auto" w:val="clear"/>
-            <w:tcMar>
-              <w:top w:type="dxa" w:w="24"/>
-              <w:left w:type="dxa" w:w="70"/>
-              <w:bottom w:type="dxa" w:w="24"/>
-              <w:right w:type="dxa" w:w="70"/>
-            </w:tcMar>
-          </w:tcPr>
-          <w:p>
-            <w:pPr>
-              <w:spacing w:after="0" w:line="200"/>
-              <w:jc w:val="left"/>
-            </w:pPr>
-            <w:r>
-              <w:rPr>
-                <w:rFonts w:ascii="Consolas" w:cs="Consolas" w:eastAsia="Consolas" w:hAnsi="Consolas"/>
-                <w:color w:val="000000"/>
-                <w:sz w:val="15"/>
-                <w:szCs w:val="15"/>
-              </w:rPr>
-              <w:t xml:space="preserve">PPOIL</w:t>
-            </w:r>
-          </w:p>
-        </w:tc>
-        <w:tc>
-          <w:tcPr>
-            <w:tcW w:type="dxa" w:w="2754"/>
-            <w:shd w:fill="F2F2F2" w:color="auto" w:val="clear"/>
-            <w:tcMar>
-              <w:top w:type="dxa" w:w="24"/>
-              <w:left w:type="dxa" w:w="70"/>
-              <w:bottom w:type="dxa" w:w="24"/>
-              <w:right w:type="dxa" w:w="70"/>
-            </w:tcMar>
-          </w:tcPr>
-          <w:p>
-            <w:pPr>
-              <w:spacing w:after="0" w:line="200"/>
-              <w:jc w:val="left"/>
-            </w:pPr>
-            <w:r>
-              <w:rPr>
-                <w:color w:val="000000"/>
-                <w:sz w:val="15"/>
-                <w:szCs w:val="15"/>
-              </w:rPr>
-              <w:t xml:space="preserve">USD / tonne</w:t>
-            </w:r>
-          </w:p>
-        </w:tc>
-      </w:tr>
-      <w:tr>
-        <w:tc>
-          <w:tcPr>
-            <w:tcW w:type="dxa" w:w="4300"/>
-            <w:tcMar>
-              <w:top w:type="dxa" w:w="24"/>
-              <w:left w:type="dxa" w:w="70"/>
-              <w:bottom w:type="dxa" w:w="24"/>
-              <w:right w:type="dxa" w:w="70"/>
-            </w:tcMar>
-          </w:tcPr>
-          <w:p>
-            <w:pPr>
-              <w:spacing w:after="0" w:line="200"/>
-              <w:jc w:val="left"/>
-            </w:pPr>
-            <w:r>
-              <w:rPr>
-                <w:color w:val="000000"/>
-                <w:sz w:val="15"/>
-                <w:szCs w:val="15"/>
-              </w:rPr>
-              <w:t xml:space="preserve">Food price index</w:t>
-            </w:r>
-          </w:p>
-        </w:tc>
-        <w:tc>
-          <w:tcPr>
-            <w:tcW w:type="dxa" w:w="2300"/>
-            <w:tcMar>
-              <w:top w:type="dxa" w:w="24"/>
-              <w:left w:type="dxa" w:w="70"/>
-              <w:bottom w:type="dxa" w:w="24"/>
-              <w:right w:type="dxa" w:w="70"/>
-            </w:tcMar>
-          </w:tcPr>
-          <w:p>
-            <w:pPr>
-              <w:spacing w:after="0" w:line="200"/>
-              <w:jc w:val="left"/>
-            </w:pPr>
-            <w:r>
-              <w:rPr>
-                <w:rFonts w:ascii="Consolas" w:cs="Consolas" w:eastAsia="Consolas" w:hAnsi="Consolas"/>
-                <w:color w:val="000000"/>
-                <w:sz w:val="15"/>
-                <w:szCs w:val="15"/>
-              </w:rPr>
-              <w:t xml:space="preserve">PFANDB</w:t>
-            </w:r>
-          </w:p>
-        </w:tc>
-        <w:tc>
-          <w:tcPr>
-            <w:tcW w:type="dxa" w:w="2754"/>
-            <w:tcMar>
-              <w:top w:type="dxa" w:w="24"/>
-              <w:left w:type="dxa" w:w="70"/>
-              <w:bottom w:type="dxa" w:w="24"/>
-              <w:right w:type="dxa" w:w="70"/>
-            </w:tcMar>
-          </w:tcPr>
-          <w:p>
-            <w:pPr>
-              <w:spacing w:after="0" w:line="200"/>
-              <w:jc w:val="left"/>
-            </w:pPr>
-            <w:r>
-              <w:rPr>
-                <w:color w:val="000000"/>
-                <w:sz w:val="15"/>
-                <w:szCs w:val="15"/>
-              </w:rPr>
-              <w:t xml:space="preserve">Indice</w:t>
-            </w:r>
-          </w:p>
-        </w:tc>
-      </w:tr>
-      <w:tr>
-        <w:tc>
-          <w:tcPr>
-            <w:tcW w:type="dxa" w:w="4300"/>
-            <w:shd w:fill="F2F2F2" w:color="auto" w:val="clear"/>
-            <w:tcMar>
-              <w:top w:type="dxa" w:w="24"/>
-              <w:left w:type="dxa" w:w="70"/>
-              <w:bottom w:type="dxa" w:w="24"/>
-              <w:right w:type="dxa" w:w="70"/>
-            </w:tcMar>
-          </w:tcPr>
-          <w:p>
-            <w:pPr>
-              <w:spacing w:after="0" w:line="200"/>
-              <w:jc w:val="left"/>
-            </w:pPr>
-            <w:r>
-              <w:rPr>
-                <w:color w:val="000000"/>
-                <w:sz w:val="15"/>
-                <w:szCs w:val="15"/>
-              </w:rPr>
-              <w:t xml:space="preserve">Non-energy price index</w:t>
-            </w:r>
-          </w:p>
-        </w:tc>
-        <w:tc>
-          <w:tcPr>
-            <w:tcW w:type="dxa" w:w="2300"/>
-            <w:shd w:fill="F2F2F2" w:color="auto" w:val="clear"/>
-            <w:tcMar>
-              <w:top w:type="dxa" w:w="24"/>
-              <w:left w:type="dxa" w:w="70"/>
-              <w:bottom w:type="dxa" w:w="24"/>
-              <w:right w:type="dxa" w:w="70"/>
-            </w:tcMar>
-          </w:tcPr>
-          <w:p>
-            <w:pPr>
-              <w:spacing w:after="0" w:line="200"/>
-              <w:jc w:val="left"/>
-            </w:pPr>
-            <w:r>
-              <w:rPr>
-                <w:rFonts w:ascii="Consolas" w:cs="Consolas" w:eastAsia="Consolas" w:hAnsi="Consolas"/>
-                <w:color w:val="000000"/>
-                <w:sz w:val="15"/>
-                <w:szCs w:val="15"/>
-              </w:rPr>
-              <w:t xml:space="preserve">PALLFNF</w:t>
-            </w:r>
-          </w:p>
-        </w:tc>
-        <w:tc>
-          <w:tcPr>
-            <w:tcW w:type="dxa" w:w="2754"/>
-            <w:shd w:fill="F2F2F2" w:color="auto" w:val="clear"/>
-            <w:tcMar>
-              <w:top w:type="dxa" w:w="24"/>
-              <w:left w:type="dxa" w:w="70"/>
-              <w:bottom w:type="dxa" w:w="24"/>
-              <w:right w:type="dxa" w:w="70"/>
-            </w:tcMar>
-          </w:tcPr>
-          <w:p>
-            <w:pPr>
-              <w:spacing w:after="0" w:line="200"/>
-              <w:jc w:val="left"/>
-            </w:pPr>
-            <w:r>
-              <w:rPr>
-                <w:color w:val="000000"/>
-                <w:sz w:val="15"/>
-                <w:szCs w:val="15"/>
-              </w:rPr>
-              <w:t xml:space="preserve">Indice</w:t>
-            </w:r>
-          </w:p>
-        </w:tc>
-      </w:tr>
-      <w:tr>
-        <w:tc>
-          <w:tcPr>
-            <w:tcW w:type="dxa" w:w="4300"/>
-            <w:tcMar>
-              <w:top w:type="dxa" w:w="24"/>
-              <w:left w:type="dxa" w:w="70"/>
-              <w:bottom w:type="dxa" w:w="24"/>
-              <w:right w:type="dxa" w:w="70"/>
-            </w:tcMar>
-          </w:tcPr>
-          <w:p>
-            <w:pPr>
-              <w:spacing w:after="0" w:line="200"/>
-              <w:jc w:val="left"/>
-            </w:pPr>
-            <w:r>
-              <w:rPr>
-                <w:color w:val="000000"/>
-                <w:sz w:val="15"/>
-                <w:szCs w:val="15"/>
-              </w:rPr>
-              <w:t xml:space="preserve">Agricultural raw materials price index</w:t>
-            </w:r>
-          </w:p>
-        </w:tc>
-        <w:tc>
-          <w:tcPr>
-            <w:tcW w:type="dxa" w:w="2300"/>
-            <w:tcMar>
-              <w:top w:type="dxa" w:w="24"/>
-              <w:left w:type="dxa" w:w="70"/>
-              <w:bottom w:type="dxa" w:w="24"/>
-              <w:right w:type="dxa" w:w="70"/>
-            </w:tcMar>
-          </w:tcPr>
-          <w:p>
-            <w:pPr>
-              <w:spacing w:after="0" w:line="200"/>
-              <w:jc w:val="left"/>
-            </w:pPr>
-            <w:r>
-              <w:rPr>
-                <w:rFonts w:ascii="Consolas" w:cs="Consolas" w:eastAsia="Consolas" w:hAnsi="Consolas"/>
-                <w:color w:val="000000"/>
-                <w:sz w:val="15"/>
-                <w:szCs w:val="15"/>
-              </w:rPr>
-              <w:t xml:space="preserve">PRAWM</w:t>
-            </w:r>
-          </w:p>
-        </w:tc>
-        <w:tc>
-          <w:tcPr>
-            <w:tcW w:type="dxa" w:w="2754"/>
-            <w:tcMar>
-              <w:top w:type="dxa" w:w="24"/>
-              <w:left w:type="dxa" w:w="70"/>
-              <w:bottom w:type="dxa" w:w="24"/>
-              <w:right w:type="dxa" w:w="70"/>
-            </w:tcMar>
-          </w:tcPr>
-          <w:p>
-            <w:pPr>
-              <w:spacing w:after="0" w:line="200"/>
-              <w:jc w:val="left"/>
-            </w:pPr>
-            <w:r>
-              <w:rPr>
-                <w:color w:val="000000"/>
-                <w:sz w:val="15"/>
-                <w:szCs w:val="15"/>
-              </w:rPr>
-              <w:t xml:space="preserve">Indice</w:t>
-            </w:r>
-          </w:p>
-        </w:tc>
-      </w:tr>
-      <w:tr>
-        <w:tc>
-          <w:tcPr>
-            <w:tcW w:type="dxa" w:w="4300"/>
-            <w:shd w:fill="F2F2F2" w:color="auto" w:val="clear"/>
-            <w:tcMar>
-              <w:top w:type="dxa" w:w="24"/>
-              <w:left w:type="dxa" w:w="70"/>
-              <w:bottom w:type="dxa" w:w="24"/>
-              <w:right w:type="dxa" w:w="70"/>
-            </w:tcMar>
-          </w:tcPr>
-          <w:p>
-            <w:pPr>
-              <w:spacing w:after="0" w:line="200"/>
-              <w:jc w:val="left"/>
-            </w:pPr>
-            <w:r>
-              <w:rPr>
-                <w:color w:val="000000"/>
-                <w:sz w:val="15"/>
-                <w:szCs w:val="15"/>
-              </w:rPr>
-              <w:t xml:space="preserve">Metals and minerals price index</w:t>
-            </w:r>
-          </w:p>
-        </w:tc>
-        <w:tc>
-          <w:tcPr>
-            <w:tcW w:type="dxa" w:w="2300"/>
-            <w:shd w:fill="F2F2F2" w:color="auto" w:val="clear"/>
-            <w:tcMar>
-              <w:top w:type="dxa" w:w="24"/>
-              <w:left w:type="dxa" w:w="70"/>
-              <w:bottom w:type="dxa" w:w="24"/>
-              <w:right w:type="dxa" w:w="70"/>
-            </w:tcMar>
-          </w:tcPr>
-          <w:p>
-            <w:pPr>
-              <w:spacing w:after="0" w:line="200"/>
-              <w:jc w:val="left"/>
-            </w:pPr>
-            <w:r>
-              <w:rPr>
-                <w:rFonts w:ascii="Consolas" w:cs="Consolas" w:eastAsia="Consolas" w:hAnsi="Consolas"/>
-                <w:color w:val="000000"/>
-                <w:sz w:val="15"/>
-                <w:szCs w:val="15"/>
-              </w:rPr>
-              <w:t xml:space="preserve">PMETA</w:t>
-            </w:r>
-          </w:p>
-        </w:tc>
-        <w:tc>
-          <w:tcPr>
-            <w:tcW w:type="dxa" w:w="2754"/>
-            <w:shd w:fill="F2F2F2" w:color="auto" w:val="clear"/>
-            <w:tcMar>
-              <w:top w:type="dxa" w:w="24"/>
-              <w:left w:type="dxa" w:w="70"/>
-              <w:bottom w:type="dxa" w:w="24"/>
-              <w:right w:type="dxa" w:w="70"/>
-            </w:tcMar>
-          </w:tcPr>
-          <w:p>
-            <w:pPr>
-              <w:spacing w:after="0" w:line="200"/>
-              <w:jc w:val="left"/>
-            </w:pPr>
-            <w:r>
-              <w:rPr>
-                <w:color w:val="000000"/>
-                <w:sz w:val="15"/>
-                <w:szCs w:val="15"/>
-              </w:rPr>
-              <w:t xml:space="preserve">Indice</w:t>
-            </w:r>
-          </w:p>
-        </w:tc>
-      </w:tr>
-      <w:tr>
-        <w:tc>
-          <w:tcPr>
-            <w:tcW w:type="dxa" w:w="4300"/>
-            <w:tcMar>
-              <w:top w:type="dxa" w:w="24"/>
-              <w:left w:type="dxa" w:w="70"/>
-              <w:bottom w:type="dxa" w:w="24"/>
-              <w:right w:type="dxa" w:w="70"/>
-            </w:tcMar>
-          </w:tcPr>
-          <w:p>
-            <w:pPr>
-              <w:spacing w:after="0" w:line="200"/>
-              <w:jc w:val="left"/>
-            </w:pPr>
-            <w:r>
-              <w:rPr>
-                <w:color w:val="000000"/>
-                <w:sz w:val="15"/>
-                <w:szCs w:val="15"/>
-              </w:rPr>
-              <w:t xml:space="preserve">Energy price index</w:t>
-            </w:r>
-          </w:p>
-        </w:tc>
-        <w:tc>
-          <w:tcPr>
-            <w:tcW w:type="dxa" w:w="2300"/>
-            <w:tcMar>
-              <w:top w:type="dxa" w:w="24"/>
-              <w:left w:type="dxa" w:w="70"/>
-              <w:bottom w:type="dxa" w:w="24"/>
-              <w:right w:type="dxa" w:w="70"/>
-            </w:tcMar>
-          </w:tcPr>
-          <w:p>
-            <w:pPr>
-              <w:spacing w:after="0" w:line="200"/>
-              <w:jc w:val="left"/>
-            </w:pPr>
-            <w:r>
-              <w:rPr>
-                <w:rFonts w:ascii="Consolas" w:cs="Consolas" w:eastAsia="Consolas" w:hAnsi="Consolas"/>
-                <w:color w:val="000000"/>
-                <w:sz w:val="15"/>
-                <w:szCs w:val="15"/>
-              </w:rPr>
-              <w:t xml:space="preserve">PNRG</w:t>
-            </w:r>
-          </w:p>
-        </w:tc>
-        <w:tc>
-          <w:tcPr>
-            <w:tcW w:type="dxa" w:w="2754"/>
-            <w:tcMar>
-              <w:top w:type="dxa" w:w="24"/>
-              <w:left w:type="dxa" w:w="70"/>
-              <w:bottom w:type="dxa" w:w="24"/>
-              <w:right w:type="dxa" w:w="70"/>
-            </w:tcMar>
-          </w:tcPr>
-          <w:p>
-            <w:pPr>
-              <w:spacing w:after="0" w:line="200"/>
-              <w:jc w:val="left"/>
-            </w:pPr>
-            <w:r>
-              <w:rPr>
-                <w:color w:val="000000"/>
-                <w:sz w:val="15"/>
-                <w:szCs w:val="15"/>
-              </w:rPr>
-              <w:t xml:space="preserve">Indice</w:t>
-            </w:r>
-          </w:p>
-        </w:tc>
-      </w:tr>
-      <w:tr>
-        <w:tc>
-          <w:tcPr>
-            <w:tcW w:type="dxa" w:w="4300"/>
-            <w:shd w:fill="F2F2F2" w:color="auto" w:val="clear"/>
-            <w:tcMar>
-              <w:top w:type="dxa" w:w="24"/>
-              <w:left w:type="dxa" w:w="70"/>
-              <w:bottom w:type="dxa" w:w="24"/>
-              <w:right w:type="dxa" w:w="70"/>
-            </w:tcMar>
-          </w:tcPr>
-          <w:p>
-            <w:pPr>
-              <w:spacing w:after="0" w:line="200"/>
-              <w:jc w:val="left"/>
-            </w:pPr>
-            <w:r>
-              <w:rPr>
-                <w:color w:val="000000"/>
-                <w:sz w:val="15"/>
-                <w:szCs w:val="15"/>
-              </w:rPr>
-              <w:t xml:space="preserve">Maize</w:t>
-            </w:r>
-          </w:p>
-        </w:tc>
-        <w:tc>
-          <w:tcPr>
-            <w:tcW w:type="dxa" w:w="2300"/>
-            <w:shd w:fill="F2F2F2" w:color="auto" w:val="clear"/>
-            <w:tcMar>
-              <w:top w:type="dxa" w:w="24"/>
-              <w:left w:type="dxa" w:w="70"/>
-              <w:bottom w:type="dxa" w:w="24"/>
-              <w:right w:type="dxa" w:w="70"/>
-            </w:tcMar>
-          </w:tcPr>
-          <w:p>
-            <w:pPr>
-              <w:spacing w:after="0" w:line="200"/>
-              <w:jc w:val="left"/>
-            </w:pPr>
-            <w:r>
-              <w:rPr>
-                <w:rFonts w:ascii="Consolas" w:cs="Consolas" w:eastAsia="Consolas" w:hAnsi="Consolas"/>
-                <w:color w:val="000000"/>
-                <w:sz w:val="15"/>
-                <w:szCs w:val="15"/>
-              </w:rPr>
-              <w:t xml:space="preserve">PMAIZMT</w:t>
-            </w:r>
-          </w:p>
-        </w:tc>
-        <w:tc>
-          <w:tcPr>
-            <w:tcW w:type="dxa" w:w="2754"/>
-            <w:shd w:fill="F2F2F2" w:color="auto" w:val="clear"/>
-            <w:tcMar>
-              <w:top w:type="dxa" w:w="24"/>
-              <w:left w:type="dxa" w:w="70"/>
-              <w:bottom w:type="dxa" w:w="24"/>
-              <w:right w:type="dxa" w:w="70"/>
-            </w:tcMar>
-          </w:tcPr>
-          <w:p>
-            <w:pPr>
-              <w:spacing w:after="0" w:line="200"/>
-              <w:jc w:val="left"/>
-            </w:pPr>
-            <w:r>
-              <w:rPr>
-                <w:color w:val="000000"/>
-                <w:sz w:val="15"/>
-                <w:szCs w:val="15"/>
-              </w:rPr>
-              <w:t xml:space="preserve">USD / tonne</w:t>
-            </w:r>
-          </w:p>
-        </w:tc>
-      </w:tr>
-      <w:tr>
-        <w:tc>
-          <w:tcPr>
-            <w:tcW w:type="dxa" w:w="4300"/>
-            <w:tcMar>
-              <w:top w:type="dxa" w:w="24"/>
-              <w:left w:type="dxa" w:w="70"/>
-              <w:bottom w:type="dxa" w:w="24"/>
-              <w:right w:type="dxa" w:w="70"/>
-            </w:tcMar>
-          </w:tcPr>
-          <w:p>
-            <w:pPr>
-              <w:spacing w:after="0" w:line="200"/>
-              <w:jc w:val="left"/>
-            </w:pPr>
-            <w:r>
-              <w:rPr>
-                <w:color w:val="000000"/>
-                <w:sz w:val="15"/>
-                <w:szCs w:val="15"/>
-              </w:rPr>
-              <w:t xml:space="preserve">Iron ore</w:t>
-            </w:r>
-          </w:p>
-        </w:tc>
-        <w:tc>
-          <w:tcPr>
-            <w:tcW w:type="dxa" w:w="2300"/>
-            <w:tcMar>
-              <w:top w:type="dxa" w:w="24"/>
-              <w:left w:type="dxa" w:w="70"/>
-              <w:bottom w:type="dxa" w:w="24"/>
-              <w:right w:type="dxa" w:w="70"/>
-            </w:tcMar>
-          </w:tcPr>
-          <w:p>
-            <w:pPr>
-              <w:spacing w:after="0" w:line="200"/>
-              <w:jc w:val="left"/>
-            </w:pPr>
-            <w:r>
-              <w:rPr>
-                <w:rFonts w:ascii="Consolas" w:cs="Consolas" w:eastAsia="Consolas" w:hAnsi="Consolas"/>
-                <w:color w:val="000000"/>
-                <w:sz w:val="15"/>
-                <w:szCs w:val="15"/>
-              </w:rPr>
-              <w:t xml:space="preserve">PIORECR</w:t>
-            </w:r>
-          </w:p>
-        </w:tc>
-        <w:tc>
-          <w:tcPr>
-            <w:tcW w:type="dxa" w:w="2754"/>
-            <w:tcMar>
-              <w:top w:type="dxa" w:w="24"/>
-              <w:left w:type="dxa" w:w="70"/>
-              <w:bottom w:type="dxa" w:w="24"/>
-              <w:right w:type="dxa" w:w="70"/>
-            </w:tcMar>
-          </w:tcPr>
-          <w:p>
-            <w:pPr>
-              <w:spacing w:after="0" w:line="200"/>
-              <w:jc w:val="left"/>
-            </w:pPr>
-            <w:r>
-              <w:rPr>
-                <w:color w:val="000000"/>
-                <w:sz w:val="15"/>
-                <w:szCs w:val="15"/>
-              </w:rPr>
-              <w:t xml:space="preserve">USD / tonne</w:t>
-            </w:r>
-          </w:p>
-        </w:tc>
-      </w:tr>
-      <w:tr>
-        <w:tc>
-          <w:tcPr>
-            <w:tcW w:type="dxa" w:w="4300"/>
-            <w:shd w:fill="F2F2F2" w:color="auto" w:val="clear"/>
-            <w:tcMar>
-              <w:top w:type="dxa" w:w="24"/>
-              <w:left w:type="dxa" w:w="70"/>
-              <w:bottom w:type="dxa" w:w="24"/>
-              <w:right w:type="dxa" w:w="70"/>
-            </w:tcMar>
-          </w:tcPr>
-          <w:p>
-            <w:pPr>
-              <w:spacing w:after="0" w:line="200"/>
-              <w:jc w:val="left"/>
-            </w:pPr>
-            <w:r>
-              <w:rPr>
-                <w:color w:val="000000"/>
-                <w:sz w:val="15"/>
-                <w:szCs w:val="15"/>
-              </w:rPr>
-              <w:t xml:space="preserve">Gold</w:t>
-            </w:r>
-          </w:p>
-        </w:tc>
-        <w:tc>
-          <w:tcPr>
-            <w:tcW w:type="dxa" w:w="2300"/>
-            <w:shd w:fill="F2F2F2" w:color="auto" w:val="clear"/>
-            <w:tcMar>
-              <w:top w:type="dxa" w:w="24"/>
-              <w:left w:type="dxa" w:w="70"/>
-              <w:bottom w:type="dxa" w:w="24"/>
-              <w:right w:type="dxa" w:w="70"/>
-            </w:tcMar>
-          </w:tcPr>
-          <w:p>
-            <w:pPr>
-              <w:spacing w:after="0" w:line="200"/>
-              <w:jc w:val="left"/>
-            </w:pPr>
-            <w:r>
-              <w:rPr>
-                <w:rFonts w:ascii="Consolas" w:cs="Consolas" w:eastAsia="Consolas" w:hAnsi="Consolas"/>
-                <w:color w:val="000000"/>
-                <w:sz w:val="15"/>
-                <w:szCs w:val="15"/>
-              </w:rPr>
-              <w:t xml:space="preserve">PGOLD</w:t>
-            </w:r>
-          </w:p>
-        </w:tc>
-        <w:tc>
-          <w:tcPr>
-            <w:tcW w:type="dxa" w:w="2754"/>
-            <w:shd w:fill="F2F2F2" w:color="auto" w:val="clear"/>
-            <w:tcMar>
-              <w:top w:type="dxa" w:w="24"/>
-              <w:left w:type="dxa" w:w="70"/>
-              <w:bottom w:type="dxa" w:w="24"/>
-              <w:right w:type="dxa" w:w="70"/>
-            </w:tcMar>
-          </w:tcPr>
-          <w:p>
-            <w:pPr>
-              <w:spacing w:after="0" w:line="200"/>
-              <w:jc w:val="left"/>
-            </w:pPr>
-            <w:r>
-              <w:rPr>
-                <w:color w:val="000000"/>
-                <w:sz w:val="15"/>
-                <w:szCs w:val="15"/>
-              </w:rPr>
-              <w:t xml:space="preserve">USD / once troy</w:t>
-            </w:r>
-          </w:p>
-        </w:tc>
-      </w:tr>
-      <w:tr>
-        <w:tc>
-          <w:tcPr>
-            <w:tcW w:type="dxa" w:w="4300"/>
-            <w:tcMar>
-              <w:top w:type="dxa" w:w="24"/>
-              <w:left w:type="dxa" w:w="70"/>
-              <w:bottom w:type="dxa" w:w="24"/>
-              <w:right w:type="dxa" w:w="70"/>
-            </w:tcMar>
-          </w:tcPr>
-          <w:p>
-            <w:pPr>
-              <w:spacing w:after="0" w:line="200"/>
-              <w:jc w:val="left"/>
-            </w:pPr>
-            <w:r>
-              <w:rPr>
-                <w:color w:val="000000"/>
-                <w:sz w:val="15"/>
-                <w:szCs w:val="15"/>
-              </w:rPr>
-              <w:t xml:space="preserve">Crude oil, Brent</w:t>
-            </w:r>
-          </w:p>
-        </w:tc>
-        <w:tc>
-          <w:tcPr>
-            <w:tcW w:type="dxa" w:w="2300"/>
-            <w:tcMar>
-              <w:top w:type="dxa" w:w="24"/>
-              <w:left w:type="dxa" w:w="70"/>
-              <w:bottom w:type="dxa" w:w="24"/>
-              <w:right w:type="dxa" w:w="70"/>
-            </w:tcMar>
-          </w:tcPr>
-          <w:p>
-            <w:pPr>
-              <w:spacing w:after="0" w:line="200"/>
-              <w:jc w:val="left"/>
-            </w:pPr>
-            <w:r>
-              <w:rPr>
-                <w:rFonts w:ascii="Consolas" w:cs="Consolas" w:eastAsia="Consolas" w:hAnsi="Consolas"/>
-                <w:color w:val="000000"/>
-                <w:sz w:val="15"/>
-                <w:szCs w:val="15"/>
-              </w:rPr>
-              <w:t xml:space="preserve">POILBRE</w:t>
-            </w:r>
-          </w:p>
-        </w:tc>
-        <w:tc>
-          <w:tcPr>
-            <w:tcW w:type="dxa" w:w="2754"/>
-            <w:tcMar>
-              <w:top w:type="dxa" w:w="24"/>
-              <w:left w:type="dxa" w:w="70"/>
-              <w:bottom w:type="dxa" w:w="24"/>
-              <w:right w:type="dxa" w:w="70"/>
-            </w:tcMar>
-          </w:tcPr>
-          <w:p>
-            <w:pPr>
-              <w:spacing w:after="0" w:line="200"/>
-              <w:jc w:val="left"/>
-            </w:pPr>
-            <w:r>
-              <w:rPr>
-                <w:color w:val="000000"/>
-                <w:sz w:val="15"/>
-                <w:szCs w:val="15"/>
-              </w:rPr>
-              <w:t xml:space="preserve">USD / baril</w:t>
-            </w:r>
-          </w:p>
-        </w:tc>
-      </w:tr>
-      <w:tr>
-        <w:tc>
-          <w:tcPr>
-            <w:tcW w:type="dxa" w:w="4300"/>
-            <w:shd w:fill="F2F2F2" w:color="auto" w:val="clear"/>
-            <w:tcMar>
-              <w:top w:type="dxa" w:w="24"/>
-              <w:left w:type="dxa" w:w="70"/>
-              <w:bottom w:type="dxa" w:w="24"/>
-              <w:right w:type="dxa" w:w="70"/>
-            </w:tcMar>
-          </w:tcPr>
-          <w:p>
-            <w:pPr>
-              <w:spacing w:after="0" w:line="200"/>
-              <w:jc w:val="left"/>
-            </w:pPr>
-            <w:r>
-              <w:rPr>
-                <w:color w:val="000000"/>
-                <w:sz w:val="15"/>
-                <w:szCs w:val="15"/>
-              </w:rPr>
-              <w:t xml:space="preserve">Crude oil, Dubai</w:t>
-            </w:r>
-          </w:p>
-        </w:tc>
-        <w:tc>
-          <w:tcPr>
-            <w:tcW w:type="dxa" w:w="2300"/>
-            <w:shd w:fill="F2F2F2" w:color="auto" w:val="clear"/>
-            <w:tcMar>
-              <w:top w:type="dxa" w:w="24"/>
-              <w:left w:type="dxa" w:w="70"/>
-              <w:bottom w:type="dxa" w:w="24"/>
-              <w:right w:type="dxa" w:w="70"/>
-            </w:tcMar>
-          </w:tcPr>
-          <w:p>
-            <w:pPr>
-              <w:spacing w:after="0" w:line="200"/>
-              <w:jc w:val="left"/>
-            </w:pPr>
-            <w:r>
-              <w:rPr>
-                <w:rFonts w:ascii="Consolas" w:cs="Consolas" w:eastAsia="Consolas" w:hAnsi="Consolas"/>
-                <w:color w:val="000000"/>
-                <w:sz w:val="15"/>
-                <w:szCs w:val="15"/>
-              </w:rPr>
-              <w:t xml:space="preserve">POILDUB</w:t>
-            </w:r>
-          </w:p>
-        </w:tc>
-        <w:tc>
-          <w:tcPr>
-            <w:tcW w:type="dxa" w:w="2754"/>
-            <w:shd w:fill="F2F2F2" w:color="auto" w:val="clear"/>
-            <w:tcMar>
-              <w:top w:type="dxa" w:w="24"/>
-              <w:left w:type="dxa" w:w="70"/>
-              <w:bottom w:type="dxa" w:w="24"/>
-              <w:right w:type="dxa" w:w="70"/>
-            </w:tcMar>
-          </w:tcPr>
-          <w:p>
-            <w:pPr>
-              <w:spacing w:after="0" w:line="200"/>
-              <w:jc w:val="left"/>
-            </w:pPr>
-            <w:r>
-              <w:rPr>
-                <w:color w:val="000000"/>
-                <w:sz w:val="15"/>
-                <w:szCs w:val="15"/>
-              </w:rPr>
-              <w:t xml:space="preserve">USD / baril</w:t>
-            </w:r>
-          </w:p>
-        </w:tc>
-      </w:tr>
-      <w:tr>
-        <w:tc>
-          <w:tcPr>
-            <w:tcW w:type="dxa" w:w="4300"/>
-            <w:tcMar>
-              <w:top w:type="dxa" w:w="24"/>
-              <w:left w:type="dxa" w:w="70"/>
-              <w:bottom w:type="dxa" w:w="24"/>
-              <w:right w:type="dxa" w:w="70"/>
-            </w:tcMar>
-          </w:tcPr>
-          <w:p>
-            <w:pPr>
-              <w:spacing w:after="0" w:line="200"/>
-              <w:jc w:val="left"/>
-            </w:pPr>
-            <w:r>
-              <w:rPr>
-                <w:color w:val="000000"/>
-                <w:sz w:val="15"/>
-                <w:szCs w:val="15"/>
-              </w:rPr>
-              <w:t xml:space="preserve">Crude oil, WTI</w:t>
-            </w:r>
-          </w:p>
-        </w:tc>
-        <w:tc>
-          <w:tcPr>
-            <w:tcW w:type="dxa" w:w="2300"/>
-            <w:tcMar>
-              <w:top w:type="dxa" w:w="24"/>
-              <w:left w:type="dxa" w:w="70"/>
-              <w:bottom w:type="dxa" w:w="24"/>
-              <w:right w:type="dxa" w:w="70"/>
-            </w:tcMar>
-          </w:tcPr>
-          <w:p>
-            <w:pPr>
-              <w:spacing w:after="0" w:line="200"/>
-              <w:jc w:val="left"/>
-            </w:pPr>
-            <w:r>
-              <w:rPr>
-                <w:rFonts w:ascii="Consolas" w:cs="Consolas" w:eastAsia="Consolas" w:hAnsi="Consolas"/>
-                <w:color w:val="000000"/>
-                <w:sz w:val="15"/>
-                <w:szCs w:val="15"/>
-              </w:rPr>
-              <w:t xml:space="preserve">POILWTI</w:t>
-            </w:r>
-          </w:p>
-        </w:tc>
-        <w:tc>
-          <w:tcPr>
-            <w:tcW w:type="dxa" w:w="2754"/>
-            <w:tcMar>
-              <w:top w:type="dxa" w:w="24"/>
-              <w:left w:type="dxa" w:w="70"/>
-              <w:bottom w:type="dxa" w:w="24"/>
-              <w:right w:type="dxa" w:w="70"/>
-            </w:tcMar>
-          </w:tcPr>
-          <w:p>
-            <w:pPr>
-              <w:spacing w:after="0" w:line="200"/>
-              <w:jc w:val="left"/>
-            </w:pPr>
-            <w:r>
-              <w:rPr>
-                <w:color w:val="000000"/>
-                <w:sz w:val="15"/>
-                <w:szCs w:val="15"/>
-              </w:rPr>
-              <w:t xml:space="preserve">USD / baril</w:t>
-            </w:r>
-          </w:p>
-        </w:tc>
-      </w:tr>
-      <w:tr>
-        <w:tc>
-          <w:tcPr>
-            <w:tcW w:type="dxa" w:w="4300"/>
-            <w:shd w:fill="F2F2F2" w:color="auto" w:val="clear"/>
-            <w:tcMar>
-              <w:top w:type="dxa" w:w="24"/>
-              <w:left w:type="dxa" w:w="70"/>
-              <w:bottom w:type="dxa" w:w="24"/>
-              <w:right w:type="dxa" w:w="70"/>
-            </w:tcMar>
-          </w:tcPr>
-          <w:p>
-            <w:pPr>
-              <w:spacing w:after="0" w:line="200"/>
-              <w:jc w:val="left"/>
-            </w:pPr>
-            <w:r>
-              <w:rPr>
-                <w:color w:val="000000"/>
-                <w:sz w:val="15"/>
-                <w:szCs w:val="15"/>
-              </w:rPr>
-              <w:t xml:space="preserve">Rice</w:t>
-            </w:r>
-          </w:p>
-        </w:tc>
-        <w:tc>
-          <w:tcPr>
-            <w:tcW w:type="dxa" w:w="2300"/>
-            <w:shd w:fill="F2F2F2" w:color="auto" w:val="clear"/>
-            <w:tcMar>
-              <w:top w:type="dxa" w:w="24"/>
-              <w:left w:type="dxa" w:w="70"/>
-              <w:bottom w:type="dxa" w:w="24"/>
-              <w:right w:type="dxa" w:w="70"/>
-            </w:tcMar>
-          </w:tcPr>
-          <w:p>
-            <w:pPr>
-              <w:spacing w:after="0" w:line="200"/>
-              <w:jc w:val="left"/>
-            </w:pPr>
-            <w:r>
-              <w:rPr>
-                <w:rFonts w:ascii="Consolas" w:cs="Consolas" w:eastAsia="Consolas" w:hAnsi="Consolas"/>
-                <w:color w:val="000000"/>
-                <w:sz w:val="15"/>
-                <w:szCs w:val="15"/>
-              </w:rPr>
-              <w:t xml:space="preserve">PRICENPQ</w:t>
-            </w:r>
-          </w:p>
-        </w:tc>
-        <w:tc>
-          <w:tcPr>
-            <w:tcW w:type="dxa" w:w="2754"/>
-            <w:shd w:fill="F2F2F2" w:color="auto" w:val="clear"/>
-            <w:tcMar>
-              <w:top w:type="dxa" w:w="24"/>
-              <w:left w:type="dxa" w:w="70"/>
-              <w:bottom w:type="dxa" w:w="24"/>
-              <w:right w:type="dxa" w:w="70"/>
-            </w:tcMar>
-          </w:tcPr>
-          <w:p>
-            <w:pPr>
-              <w:spacing w:after="0" w:line="200"/>
-              <w:jc w:val="left"/>
-            </w:pPr>
-            <w:r>
-              <w:rPr>
-                <w:color w:val="000000"/>
-                <w:sz w:val="15"/>
-                <w:szCs w:val="15"/>
-              </w:rPr>
-              <w:t xml:space="preserve">USD / tonne</w:t>
-            </w:r>
-          </w:p>
-        </w:tc>
-      </w:tr>
-      <w:tr>
-        <w:tc>
-          <w:tcPr>
-            <w:tcW w:type="dxa" w:w="4300"/>
-            <w:tcMar>
-              <w:top w:type="dxa" w:w="24"/>
-              <w:left w:type="dxa" w:w="70"/>
-              <w:bottom w:type="dxa" w:w="24"/>
-              <w:right w:type="dxa" w:w="70"/>
-            </w:tcMar>
-          </w:tcPr>
-          <w:p>
-            <w:pPr>
-              <w:spacing w:after="0" w:line="200"/>
-              <w:jc w:val="left"/>
-            </w:pPr>
-            <w:r>
-              <w:rPr>
-                <w:color w:val="000000"/>
-                <w:sz w:val="15"/>
-                <w:szCs w:val="15"/>
-              </w:rPr>
-              <w:t xml:space="preserve">Sawnwood, Cameroon</w:t>
-            </w:r>
-          </w:p>
-        </w:tc>
-        <w:tc>
-          <w:tcPr>
-            <w:tcW w:type="dxa" w:w="2300"/>
-            <w:tcMar>
-              <w:top w:type="dxa" w:w="24"/>
-              <w:left w:type="dxa" w:w="70"/>
-              <w:bottom w:type="dxa" w:w="24"/>
-              <w:right w:type="dxa" w:w="70"/>
-            </w:tcMar>
-          </w:tcPr>
-          <w:p>
-            <w:pPr>
-              <w:spacing w:after="0" w:line="200"/>
-              <w:jc w:val="left"/>
-            </w:pPr>
-            <w:r>
-              <w:rPr>
-                <w:rFonts w:ascii="Consolas" w:cs="Consolas" w:eastAsia="Consolas" w:hAnsi="Consolas"/>
-                <w:color w:val="000000"/>
-                <w:sz w:val="15"/>
-                <w:szCs w:val="15"/>
-              </w:rPr>
-              <w:t xml:space="preserve">PSAWMAL</w:t>
-            </w:r>
-          </w:p>
-        </w:tc>
-        <w:tc>
-          <w:tcPr>
-            <w:tcW w:type="dxa" w:w="2754"/>
-            <w:tcMar>
-              <w:top w:type="dxa" w:w="24"/>
-              <w:left w:type="dxa" w:w="70"/>
-              <w:bottom w:type="dxa" w:w="24"/>
-              <w:right w:type="dxa" w:w="70"/>
-            </w:tcMar>
-          </w:tcPr>
-          <w:p>
-            <w:pPr>
-              <w:spacing w:after="0" w:line="200"/>
-              <w:jc w:val="left"/>
-            </w:pPr>
-            <w:r>
-              <w:rPr>
-                <w:color w:val="000000"/>
-                <w:sz w:val="15"/>
-                <w:szCs w:val="15"/>
-              </w:rPr>
-              <w:t xml:space="preserve">USD / m3</w:t>
-            </w:r>
-          </w:p>
-        </w:tc>
-      </w:tr>
-      <w:tr>
-        <w:tc>
-          <w:tcPr>
-            <w:tcW w:type="dxa" w:w="4300"/>
-            <w:shd w:fill="F2F2F2" w:color="auto" w:val="clear"/>
-            <w:tcMar>
-              <w:top w:type="dxa" w:w="24"/>
-              <w:left w:type="dxa" w:w="70"/>
-              <w:bottom w:type="dxa" w:w="24"/>
-              <w:right w:type="dxa" w:w="70"/>
-            </w:tcMar>
-          </w:tcPr>
-          <w:p>
-            <w:pPr>
-              <w:spacing w:after="0" w:line="200"/>
-              <w:jc w:val="left"/>
-            </w:pPr>
-            <w:r>
-              <w:rPr>
-                <w:color w:val="000000"/>
-                <w:sz w:val="15"/>
-                <w:szCs w:val="15"/>
-              </w:rPr>
-              <w:t xml:space="preserve">Sugar</w:t>
-            </w:r>
-          </w:p>
-        </w:tc>
-        <w:tc>
-          <w:tcPr>
-            <w:tcW w:type="dxa" w:w="2300"/>
-            <w:shd w:fill="F2F2F2" w:color="auto" w:val="clear"/>
-            <w:tcMar>
-              <w:top w:type="dxa" w:w="24"/>
-              <w:left w:type="dxa" w:w="70"/>
-              <w:bottom w:type="dxa" w:w="24"/>
-              <w:right w:type="dxa" w:w="70"/>
-            </w:tcMar>
-          </w:tcPr>
-          <w:p>
-            <w:pPr>
-              <w:spacing w:after="0" w:line="200"/>
-              <w:jc w:val="left"/>
-            </w:pPr>
-            <w:r>
-              <w:rPr>
-                <w:rFonts w:ascii="Consolas" w:cs="Consolas" w:eastAsia="Consolas" w:hAnsi="Consolas"/>
-                <w:color w:val="000000"/>
-                <w:sz w:val="15"/>
-                <w:szCs w:val="15"/>
-              </w:rPr>
-              <w:t xml:space="preserve">PSUGAISA</w:t>
-            </w:r>
-          </w:p>
-        </w:tc>
-        <w:tc>
-          <w:tcPr>
-            <w:tcW w:type="dxa" w:w="2754"/>
-            <w:shd w:fill="F2F2F2" w:color="auto" w:val="clear"/>
-            <w:tcMar>
-              <w:top w:type="dxa" w:w="24"/>
-              <w:left w:type="dxa" w:w="70"/>
-              <w:bottom w:type="dxa" w:w="24"/>
-              <w:right w:type="dxa" w:w="70"/>
-            </w:tcMar>
-          </w:tcPr>
-          <w:p>
-            <w:pPr>
-              <w:spacing w:after="0" w:line="200"/>
-              <w:jc w:val="left"/>
-            </w:pPr>
-            <w:r>
-              <w:rPr>
-                <w:color w:val="000000"/>
-                <w:sz w:val="15"/>
-                <w:szCs w:val="15"/>
-              </w:rPr>
-              <w:t xml:space="preserve">cents US / livre</w:t>
-            </w:r>
-          </w:p>
-        </w:tc>
-      </w:tr>
-    </w:tbl>
-    <w:p>
-      <w:pPr>
-        <w:spacing w:after="180" w:before="70"/>
-      </w:pPr>
-      <w:r>
-        <w:rPr>
-          <w:i/>
-          <w:iCs/>
-          <w:color w:val="5C6672"/>
-          <w:sz w:val="16"/>
-          <w:szCs w:val="16"/>
-        </w:rPr>
-        <w:t xml:space="preserve">Source: FMI · PCPS</w:t>
-      </w:r>
-    </w:p>
-    <w:p>
-      <w:pPr>
-        <w:spacing w:after="160" w:line="288"/>
-        <w:jc w:val="both"/>
-      </w:pPr>
-      <w:r>
-        <w:rPr>
-          <w:b w:val="false"/>
-          <w:bCs w:val="false"/>
-          <w:i w:val="false"/>
-          <w:iCs w:val="false"/>
-          <w:sz w:val="21"/>
-          <w:szCs w:val="21"/>
-        </w:rPr>
-        <w:t xml:space="preserve"/>
+        <w:t xml:space="preserve">The tables below list the 313 active indicators by category. The collection code is the one used with the provider: it must not be altered. Unless stated otherwise the frequency is annual; commodity prices are monthly and also aggregated into annual averages.</w:t>
       </w:r>
     </w:p>
     <w:p>
@@ -36362,7 +33949,7 @@
           <w:sz w:val="17"/>
           <w:szCs w:val="17"/>
         </w:rPr>
-        <w:t xml:space="preserve">Table 10. Recognised frequencies</w:t>
+        <w:t xml:space="preserve">Table 9. Recognised frequencies</w:t>
       </w:r>
     </w:p>
     <w:p>
@@ -37131,7 +34718,7 @@
           <w:sz w:val="17"/>
           <w:szCs w:val="17"/>
         </w:rPr>
-        <w:t xml:space="preserve">Table 11. Terms used in this manual</w:t>
+        <w:t xml:space="preserve">Table 10. Terms used in this manual</w:t>
       </w:r>
     </w:p>
     <w:p>
@@ -37412,7 +34999,7 @@
         <w:sz w:val="17"/>
         <w:szCs w:val="17"/>
       </w:rPr>
-      <w:t xml:space="preserve">OPESc+ 2.0, user manual</w:t>
+      <w:t xml:space="preserve">OPESc+ 2.1, user manual</w:t>
     </w:r>
     <w:r>
       <w:rPr>

</xml_diff>